<commit_message>
Polish Platform Overview: hand-rolled charts + real loading skeletons
Adds three charts (contractor status stacked bar, jobs-by-status ordinal
ramp, KB content coverage by trade) following the workspace's dataviz
skill end to end — form chosen before color, status/ordinal/categorical
tokens applied by the job each chart does, hover tooltips with keyboard
focus parity. Replaces the previously unstyled "Loading..." text (zero
CSS existed for it anywhere) with real animated skeleton placeholders.

Verified live in a real browser: all three charts screenshotted with
real data, tooltip hierarchy confirmed on hover, and the skeleton state
captured mid-load via network throttling rather than assumed from code.

Co-Authored-By: Claude Sonnet 5 <noreply@anthropic.com>
</commit_message>
<xml_diff>
--- a/FieldLoop_End_to_End_Implementation_Guide.docx
+++ b/FieldLoop_End_to_End_Implementation_Guide.docx
@@ -177,6 +177,14 @@
       </w:pPr>
       <w:r>
         <w:t>12. Groq API Setup (Vendor Account Provisioning)</w:t>
+      </w:r>
+    </w:p>
+    <w:p>
+      <w:pPr>
+        <w:pStyle w:val="25"/>
+      </w:pPr>
+      <w:r>
+        <w:t>13. Platform Overview (Admin, Cross-Contractor Dashboard)</w:t>
       </w:r>
     </w:p>
     <w:p>
@@ -946,6 +954,12 @@
     <w:p>
       <w:r>
         <w:br w:type="page"/>
+      </w:r>
+    </w:p>
+    <w:p>
+      <w:pPr/>
+      <w:r>
+        <w:t>Update (later session): Invoices &amp; Approvals (Section 8.6), View Job File (Section 8.7), and contractor-side Knowledge Base submission (Section 8.8, Section 11.4) were added to the Contractor Command Dashboard. Invoices &amp; Approvals went through a real correction mid-build — an initial version let the contractor create/edit estimates and invoices directly, which turned out to contradict the documented workflow (the technician creates and sends these from the mobile app; the contractor only approves or rejects a customer-signed one); the wrong Lambdas were torn down, not just unwired, and the surviving endpoint was narrowed accordingly — see Section 8.6 for the full story. A new admin-only, cross-contractor Platform Overview (Section 13) was also built, covering every contractor's status/usage/revenue, compliance expirations, and a real KB submission review queue, then reworked from a single static page into a real tabbed dashboard with a per-contractor drill-down page after a dedicated design pass.</w:t>
       </w:r>
     </w:p>
     <w:p>
@@ -9931,6 +9945,310 @@
     </w:p>
     <w:p>
       <w:pPr>
+        <w:pStyle w:val="3"/>
+      </w:pPr>
+      <w:r>
+        <w:t>8.6 Invoices &amp; Approvals — Real Data, Then a Correction</w:t>
+      </w:r>
+    </w:p>
+    <w:p>
+      <w:pPr>
+        <w:pStyle w:val="4"/>
+      </w:pPr>
+      <w:r>
+        <w:t>Why</w:t>
+      </w:r>
+    </w:p>
+    <w:p>
+      <w:pPr/>
+      <w:r>
+        <w:t>Panels 7 (“Invoices &amp; payments”) and 2 (“Approvals queue”) were the last two Contractor Command Dashboard panels wired to mock data (dashboardData.js and inline mock state) from the original build spec, alongside fleet, customers, reports, and team/RBAC — that last group stayed mock and out of scope for this pass. This work made Invoices and Approvals real.</w:t>
+      </w:r>
+    </w:p>
+    <w:p>
+      <w:pPr>
+        <w:pStyle w:val="4"/>
+      </w:pPr>
+      <w:r>
+        <w:t>What was built — first pass</w:t>
+      </w:r>
+    </w:p>
+    <w:p>
+      <w:pPr/>
+      <w:r>
+        <w:t>Six new Lambdas: list-invoices, create-invoice, update-invoice, list-estimates, create-estimate, delete-estimate, plus a version of update-estimate that accepted any status transition and tier editing. The dashboard gained “+ New estimate” / “+ New invoice” buttons opening creation modals, and a full set of actions on both panels: Delete, Edit tiers, Send to customer, Approve &amp; bill, Reject on estimates; Send invoice, Mark paid on invoices. The reasoning at the time: invoices and estimates_and_change_orders both had zero real rows and no other writer, so without some creation path the panels would stay permanently empty.</w:t>
+      </w:r>
+    </w:p>
+    <w:p>
+      <w:pPr>
+        <w:pStyle w:val="4"/>
+      </w:pPr>
+      <w:r>
+        <w:t>Problem encountered: contractor-side creation contradicted the documented workflow</w:t>
+      </w:r>
+    </w:p>
+    <w:p>
+      <w:pPr/>
+      <w:r>
+        <w:t>The reasoning above turned out to be wrong, and not because of an ambiguous spec — checking the actual project documents against the code found a direct contradiction that had simply not been checked before building. The project owner described the intended workflow directly: the technician creates an estimate or invoice by voice on the mobile app, the mobile app sends it straight to the customer (SMS/email, technician-side), and the contractor's only role on the dashboard is to view it and approve or reject a customer-signed one before it is billed — never create, edit, or send. Three independent sources confirmed this once actually checked: (1) Fieldloop Docs\FieldLoop_Contractor_Command_Dashboard_SPEC.md §13b's permission matrix, which already listed Owner/Admin as “✓ Approve” for Estimates &amp; Approvals (not “Create”), Technician (mobile) as “◐ Create only,” and whose §4/§9 panel descriptions never included a “+ New estimate”/“+ New invoice” affordance in the first place — that button was invented this session, not carried over from any source design; (2) the 8-beat job spine (Section 6.4 of this document): Beat 6 “Estimate” is driven by “Technician voice + customer,” Beat 7 “Execute &amp; invoice” by “Technician + Stripe Connect” — only Beat 1 “Intake” names the contractor's dispatcher; (3) the schema itself: estimates_and_change_orders has no creation-authorship column at all, only owner_approved_ts / owner_approved_by (references contractor_users) — the table was built to record who approves, not who creates.</w:t>
+      </w:r>
+    </w:p>
+    <w:p>
+      <w:pPr>
+        <w:pStyle w:val="4"/>
+      </w:pPr>
+      <w:r>
+        <w:t>The correction</w:t>
+      </w:r>
+    </w:p>
+    <w:p>
+      <w:pPr/>
+      <w:r>
+        <w:t>create-estimate, create-invoice, delete-estimate, and update-invoice were torn down completely — not just unwired from the frontend. Since these four had been built and found wrong inside the same session, with zero real usage history worth preserving, they were treated differently from the Section 11.2 KB pilot precedent (where retired Lambdas were deliberately left deployed, idle, because tearing down infrastructure with real history is a harder-to-reverse step than removing a dead frontend reference): the AWS Lambda functions were deleted (aws lambda delete-function), their API Gateway routes and integrations deleted, and the local backend/functions/ source folders removed outright. update-estimate survived, narrowed: it now only accepts { estimate_id, status: 'approved' | 'rejected' }, no tier editing, and it additionally refuses the action unless the estimate's current status is already 'signed' — verified live: attempting to approve a draft estimate returns a 400 with a clear message, not a silent no-op. On approval it stamps owner_approved_ts / owner_approved_by, exactly matching what the schema was built for. On the frontend, the “+ New” buttons and both creation modals were removed; the Approvals queue card became read-only except Approve/Reject buttons that only render when an estimate's status is 'signed'; the Invoices table became a plain read-only list with no actions column at all.</w:t>
+      </w:r>
+    </w:p>
+    <w:p>
+      <w:pPr>
+        <w:pStyle w:val="4"/>
+      </w:pPr>
+      <w:r>
+        <w:t>What was tested (real, live — not just code review)</w:t>
+      </w:r>
+    </w:p>
+    <w:p>
+      <w:pPr>
+        <w:pStyle w:val="25"/>
+      </w:pPr>
+      <w:r>
+        <w:t>Confirmed all four retired routes return 404 after teardown.</w:t>
+      </w:r>
+    </w:p>
+    <w:p>
+      <w:pPr>
+        <w:pStyle w:val="25"/>
+      </w:pPr>
+      <w:r>
+        <w:t>Confirmed update-estimate refuses to approve/reject anything not currently 'signed', with the exact expected error message.</w:t>
+      </w:r>
+    </w:p>
+    <w:p>
+      <w:pPr>
+        <w:pStyle w:val="25"/>
+      </w:pPr>
+      <w:r>
+        <w:t>Seeded a real disposable 'signed' change order directly (simulating what the mobile app will eventually write), confirmed a real signed → approved transition works and stamps owner_approved_ts/owner_approved_by correctly, and confirmed re-approving an already-decided row is correctly blocked.</w:t>
+      </w:r>
+    </w:p>
+    <w:p>
+      <w:pPr>
+        <w:pStyle w:val="25"/>
+      </w:pPr>
+      <w:r>
+        <w:t>Real browser (Playwright): confirmed no “+ New estimate”/“+ New invoice” button exists anywhere on the dashboard, and that clicking “Approve &amp; bill” on a seeded signed change order correctly flips it to APPROVED, removes the action buttons, and updates the “Awaiting approval” KPI live, with zero console errors.</w:t>
+      </w:r>
+    </w:p>
+    <w:p>
+      <w:pPr>
+        <w:pStyle w:val="4"/>
+      </w:pPr>
+      <w:r>
+        <w:t>Files</w:t>
+      </w:r>
+    </w:p>
+    <w:p>
+      <w:pPr/>
+      <w:r>
+        <w:t>backend/functions/list-invoices/, list-estimates/, update-estimate/ (new/kept, deployed); backend/functions/create-estimate/, create-invoice/, delete-estimate/, update-invoice/ (built, then fully deleted — AWS Lambdas and local source both gone); backend/functions/package-lambda.ps1 (ValidateSet updated to match); src/command-dashboard/ContractorCommandDashboard.jsx (Panel 2 and Panel 7 rewritten); src/shared/services/api.js (createEstimate, createInvoice, deleteEstimate, sendInvoice, markInvoicePaid added, then removed; listInvoices, listEstimates, updateEstimate kept).</w:t>
+      </w:r>
+    </w:p>
+    <w:p>
+      <w:pPr>
+        <w:pStyle w:val="3"/>
+      </w:pPr>
+      <w:r>
+        <w:t>8.7 View Job File</w:t>
+      </w:r>
+    </w:p>
+    <w:p>
+      <w:pPr>
+        <w:pStyle w:val="4"/>
+      </w:pPr>
+      <w:r>
+        <w:t>Why</w:t>
+      </w:r>
+    </w:p>
+    <w:p>
+      <w:pPr/>
+      <w:r>
+        <w:t>The dispatch board's “View job file” button (on every job card) had no onClick handler at all — a dead button, clicking it did nothing. Separately, Panel 6 (“Live field data stream”) already existed but was permanently hardcoded to a fictional job FL-2847 with fabricated GPS/photo/barcode/SMS/e-signature events, regardless of which job was actually being viewed.</w:t>
+      </w:r>
+    </w:p>
+    <w:p>
+      <w:pPr>
+        <w:pStyle w:val="4"/>
+      </w:pPr>
+      <w:r>
+        <w:t>What was built</w:t>
+      </w:r>
+    </w:p>
+    <w:p>
+      <w:pPr/>
+      <w:r>
+        <w:t>A real check against the live database corrected an assumption this document had carried since Section 6: field_events already has real data — 55 live rows at the time of this build, written directly by the technician mobile app (nothing in this repository's own Lambdas writes to that table; the mobile app is writing to it independently). A new Lambda, get-job-file (POST /jobs/job-file, owner_admin, ownership-checked the same way assign-job checks job/technician ownership), returns one specific job's real field_events timeline plus basic job/customer/technician context. The dispatch board's “View job file” button now opens a JobFileModal scoped to that exact job — deliberately not reusing Panel 6, which was left exactly as it was (still hardcoded, still fictional) since redesigning it was explicitly out of scope for this pass, agreed with the project owner rather than assumed.</w:t>
+      </w:r>
+    </w:p>
+    <w:p>
+      <w:pPr>
+        <w:pStyle w:val="4"/>
+      </w:pPr>
+      <w:r>
+        <w:t>What was tested (real, live — not just code review)</w:t>
+      </w:r>
+    </w:p>
+    <w:p>
+      <w:pPr>
+        <w:pStyle w:val="25"/>
+      </w:pPr>
+      <w:r>
+        <w:t>Confirmed the read path against a job with zero events: renders an honest “No field events recorded for this job yet” empty state, not an error.</w:t>
+      </w:r>
+    </w:p>
+    <w:p>
+      <w:pPr>
+        <w:pStyle w:val="25"/>
+      </w:pPr>
+      <w:r>
+        <w:t>Confirmed against a job with a real inserted event (disposable, deleted after verification): the event rendered with the correct label, timestamp, and technician name.</w:t>
+      </w:r>
+    </w:p>
+    <w:p>
+      <w:pPr>
+        <w:pStyle w:val="25"/>
+      </w:pPr>
+      <w:r>
+        <w:t>Real browser (Playwright): opened the modal for a specific job, confirmed it showed that job's real address/customer/status — not any other job's — and confirmed a second job with real pre-existing field_events (written by the actual mobile app, not seeded) rendered its real timeline correctly.</w:t>
+      </w:r>
+    </w:p>
+    <w:p>
+      <w:pPr>
+        <w:pStyle w:val="4"/>
+      </w:pPr>
+      <w:r>
+        <w:t>Files</w:t>
+      </w:r>
+    </w:p>
+    <w:p>
+      <w:pPr/>
+      <w:r>
+        <w:t>backend/functions/get-job-file/ (new Lambda, deployed); src/command-dashboard/ContractorCommandDashboard.jsx (View job file button wired to a new JobFileModal component; jobStatusColor moved to module scope so the modal, defined outside the main component, can use it); src/shared/services/api.js (getJobFile added).</w:t>
+      </w:r>
+    </w:p>
+    <w:p>
+      <w:pPr>
+        <w:pStyle w:val="3"/>
+      </w:pPr>
+      <w:r>
+        <w:t>8.8 Contractor-Side Knowledge Base Submission</w:t>
+      </w:r>
+    </w:p>
+    <w:p>
+      <w:pPr>
+        <w:pStyle w:val="4"/>
+      </w:pPr>
+      <w:r>
+        <w:t>Why</w:t>
+      </w:r>
+    </w:p>
+    <w:p>
+      <w:pPr/>
+      <w:r>
+        <w:t>Checked directly rather than assumed: no feature existed anywhere — not the retired Section 11.2 pilot, not the live Section 11.3 system — for a contractor to submit their own fact to the Knowledge Base. Grepping the entire Contractor Command Dashboard frontend for any KB reference returned zero hits, and api.js only exposed listKbTrades/searchKbEntries, no write method.</w:t>
+      </w:r>
+    </w:p>
+    <w:p>
+      <w:pPr>
+        <w:pStyle w:val="4"/>
+      </w:pPr>
+      <w:r>
+        <w:t>What was built</w:t>
+      </w:r>
+    </w:p>
+    <w:p>
+      <w:pPr/>
+      <w:r>
+        <w:t>A new Lambda, submit-kb-entry (POST /kb/submit, owner_admin), lets a contractor submit a fact: it validates a chosen trade against real kb_trades, resolves-or-creates the subcategory/category by name (the same slugify + resolve-or-create pattern import-kb-entries.mjs already uses, ported inline since the trade itself must already exist but a subcategory/category may be new), embeds the fact via OpenAI (text-embedding-3-small, matching search-kb-entries's existing pattern), and inserts it as status: 'pending' with a per-submission-unique import_batch (contractor_submission_&lt;contractor id prefix&gt;_&lt;timestamp&gt;) so a reviewer can act on exactly one submission without touching unrelated pending rows. A companion Lambda, list-my-kb-submissions, lets the contractor see their own submissions' review status — added specifically so submitting is not a black hole with no feedback. A new Panel 11 (“Knowledge Base”) on the Contractor Command Dashboard holds the submission form and a “Your submissions” status table.</w:t>
+      </w:r>
+    </w:p>
+    <w:p>
+      <w:pPr>
+        <w:pStyle w:val="4"/>
+      </w:pPr>
+      <w:r>
+        <w:t>Review workflow</w:t>
+      </w:r>
+    </w:p>
+    <w:p>
+      <w:pPr/>
+      <w:r>
+        <w:t>Confirmed with the project owner as the desired pattern rather than assumed: reviewing a contractor submission mirrors the existing approve-kb-entries.mjs script exactly. A new companion script, backend/scripts/reject-kb-entries.mjs, was added alongside it, same shape, flipping status to 'rejected' instead of 'approved'. This was the state of KB review until the Platform Overview build (Section 13) added a real in-app approve/reject action specifically for contractor submissions — see Section 11.4 and Section 13 for how that superseded the script-only path for this one category of entries, while the original bulk-CSV-import review stays script-based.</w:t>
+      </w:r>
+    </w:p>
+    <w:p>
+      <w:pPr>
+        <w:pStyle w:val="4"/>
+      </w:pPr>
+      <w:r>
+        <w:t>What was tested (real, live — not just code review)</w:t>
+      </w:r>
+    </w:p>
+    <w:p>
+      <w:pPr>
+        <w:pStyle w:val="25"/>
+      </w:pPr>
+      <w:r>
+        <w:t>Submitted a real disposable fact via the API, confirmed it landed as status: 'pending' with a real embedding and the correctly resolved trade/category.</w:t>
+      </w:r>
+    </w:p>
+    <w:p>
+      <w:pPr>
+        <w:pStyle w:val="25"/>
+      </w:pPr>
+      <w:r>
+        <w:t>Confirmed it appeared in list-my-kb-submissions with the right joined trade/category names.</w:t>
+      </w:r>
+    </w:p>
+    <w:p>
+      <w:pPr>
+        <w:pStyle w:val="25"/>
+      </w:pPr>
+      <w:r>
+        <w:t>Ran reject-kb-entries.mjs against its real import_batch and confirmed the status flipped — proving the full submit → pending → reviewed loop, not just the submission half.</w:t>
+      </w:r>
+    </w:p>
+    <w:p>
+      <w:pPr>
+        <w:pStyle w:val="25"/>
+      </w:pPr>
+      <w:r>
+        <w:t>Real browser (Playwright): filled and submitted the form, saw the confirmation toast and the new row appear in “Your submissions” with a pending pill.</w:t>
+      </w:r>
+    </w:p>
+    <w:p>
+      <w:pPr>
+        <w:pStyle w:val="4"/>
+      </w:pPr>
+      <w:r>
+        <w:t>Files</w:t>
+      </w:r>
+    </w:p>
+    <w:p>
+      <w:pPr/>
+      <w:r>
+        <w:t>backend/functions/submit-kb-entry/, list-my-kb-submissions/ (new Lambdas, deployed); backend/scripts/reject-kb-entries.mjs (new); src/command-dashboard/ContractorCommandDashboard.jsx (new Panel 11 via KnowledgeBaseSubmission component; dashboard.css's page-N/section-N rule extended to page-11/section-11); src/shared/services/api.js (submitKbEntry, listMyKbSubmissions added).</w:t>
+      </w:r>
+    </w:p>
+    <w:p>
+      <w:pPr>
         <w:pStyle w:val="2"/>
       </w:pPr>
       <w:r>
@@ -11630,6 +11948,26 @@
     </w:p>
     <w:p>
       <w:pPr>
+        <w:pStyle w:val="3"/>
+      </w:pPr>
+      <w:r>
+        <w:t>11.4 Contractor Self-Service Submission — Live</w:t>
+      </w:r>
+    </w:p>
+    <w:p>
+      <w:pPr/>
+      <w:r>
+        <w:t>This resolves one of the items listed as open in Section 11.3 above (“a self-serve content upload interface — today, importing a new batch of facts requires a developer to run a script by hand”): a contractor can now submit an individual fact directly from the Contractor Command Dashboard (Section 8.8), landing as status: 'pending' the same way a bulk-imported row does, reviewed via the same script pair (approve-kb-entries.mjs / reject-kb-entries.mjs) used for bulk imports, or — once the Platform Overview was built — via a real approve/reject action in that admin page (Section 13.4) scoped specifically to contractor submissions. This does not replace the bulk-import path (backend/scripts/import-kb-entries.mjs), which remains how a large batch of client-supplied content gets loaded; it adds a second, individual-fact path for a contractor's own field knowledge.</w:t>
+      </w:r>
+    </w:p>
+    <w:p>
+      <w:pPr/>
+      <w:r>
+        <w:t>Still open: which AI model performs the pre-approval accuracy spot-check remains the client's explicit, undecided call (Section 11.3); the admin-side review UI (Section 13.4) currently just approves/rejects as submitted, with no automated check in between.</w:t>
+      </w:r>
+    </w:p>
+    <w:p>
+      <w:pPr>
         <w:pStyle w:val="2"/>
       </w:pPr>
       <w:r>
@@ -11727,6 +12065,501 @@
       </w:pPr>
       <w:r>
         <w:t>Click through the defaults → Store</w:t>
+      </w:r>
+    </w:p>
+    <w:p>
+      <w:pPr>
+        <w:pStyle w:val="2"/>
+      </w:pPr>
+      <w:r>
+        <w:t>13. Platform Overview (Admin, Cross-Contractor Dashboard)</w:t>
+      </w:r>
+    </w:p>
+    <w:p>
+      <w:pPr>
+        <w:pStyle w:val="3"/>
+      </w:pPr>
+      <w:r>
+        <w:t>13.1 Why</w:t>
+      </w:r>
+    </w:p>
+    <w:p>
+      <w:pPr/>
+      <w:r>
+        <w:t>Everything built so far in this document is scoped to one contractor at a time (the Registration Dashboard's 8-step wizard loads one contractor; the Contractor Command Dashboard is that contractor's own view of their own data). The project owner asked for a genuinely new surface: a page for FieldLoop staff — specifically the client and the Jenex development team, not a contractor — to see the whole platform at once. Requested minimum: how many contractors exist and their status, individual contractor detail, usage per contractor, and revenue per contractor and in aggregate.</w:t>
+      </w:r>
+    </w:p>
+    <w:p>
+      <w:pPr>
+        <w:pStyle w:val="3"/>
+      </w:pPr>
+      <w:r>
+        <w:t>13.2 Data audit performed before building anything</w:t>
+      </w:r>
+    </w:p>
+    <w:p>
+      <w:pPr/>
+      <w:r>
+        <w:t>Live queries against the real Supabase project, not the schema documents alone, since the document's own recurring lesson (Section 5.2) is that intent and deployed reality regularly diverge:</w:t>
+      </w:r>
+    </w:p>
+    <w:p>
+      <w:pPr>
+        <w:pStyle w:val="25"/>
+      </w:pPr>
+      <w:r>
+        <w:t>19 contractors rows exist, but only 15 have a contractor_system_meta row at all (9 active, 6 pending) — 4 (“Luxe renovation”, “luxe” ×2, “reno”) have none, a live instance of the meta-row-insert bug already documented in Section 5.2. A naive status-breakdown query would silently drop these unless it explicitly handles the missing-row case.</w:t>
+      </w:r>
+    </w:p>
+    <w:p>
+      <w:pPr>
+        <w:pStyle w:val="25"/>
+      </w:pPr>
+      <w:r>
+        <w:t>is_sandbox is true on 0 of 19 contractors — meaning the existing jenex_dev role (sandbox-only by design, Section 7.3) currently shows nothing at all against real data. This directly shaped the role decision below.</w:t>
+      </w:r>
+    </w:p>
+    <w:p>
+      <w:pPr>
+        <w:pStyle w:val="25"/>
+      </w:pPr>
+      <w:r>
+        <w:t>Login tracking is a dead column, not a working feature: fl_users.last_login_at and contractor_users.last_login_at both exist in the schema, but every single row (8 fl_users, 5 contractor_users) has last_login_at = null — nothing in this codebase ever writes to it, since Supabase Auth happens client-side via the SDK, never through a Lambda that could set it.</w:t>
+      </w:r>
+    </w:p>
+    <w:p>
+      <w:pPr>
+        <w:pStyle w:val="25"/>
+      </w:pPr>
+      <w:r>
+        <w:t>Revenue is genuinely $0 everywhere, not a display bug: jobs.total_invoiced / total_paid / platform_fee_amount are real columns but 0 of 59 real jobs have any of them set; invoices has 0 rows (Section 8.6 — nothing writes to it yet, that is the mobile team's build). contractor_financials.platform_fee_rate (flat 1.95%, confirmed live) is the fee rate, not revenue collected — there is no subscription/billing-plan table anywhere in this schema, consistent with the “transaction-fee-only, no subscription” business model (Section 6.1).</w:t>
+      </w:r>
+    </w:p>
+    <w:p>
+      <w:pPr>
+        <w:pStyle w:val="25"/>
+      </w:pPr>
+      <w:r>
+        <w:t>kb_entries.reviewed_by and created_by both have no foreign-key constraint (verified via probe-insert) — safe to set reviewed_by directly to an fl_users.id.</w:t>
+      </w:r>
+    </w:p>
+    <w:p>
+      <w:pPr>
+        <w:pStyle w:val="3"/>
+      </w:pPr>
+      <w:r>
+        <w:t>13.3 Decisions made with the project owner before building</w:t>
+      </w:r>
+    </w:p>
+    <w:p>
+      <w:pPr>
+        <w:pStyle w:val="25"/>
+      </w:pPr>
+      <w:r>
+        <w:t>Role: gated behind the existing admin fl_users role — no new role added to the schema. jenex_dev was deliberately not reused, since it is sandbox-restricted by design and shows nothing against real data per the audit above. Confirmed with the project owner that the Jenex development team should also get full admin-level access here, the same as the client, rather than staying sandbox-limited.</w:t>
+      </w:r>
+    </w:p>
+    <w:p>
+      <w:pPr>
+        <w:pStyle w:val="25"/>
+      </w:pPr>
+      <w:r>
+        <w:t>Build scope: “core” (contractor list/status/detail, real usage counts, a compliance-expiration panel) plus every proposed extra — a data-health panel for contractors missing a status row, KB content/submission stats, and a CloudWatch pointer. Explicitly not included in this pass: new login-activity instrumentation (a login_events table plus wiring it into the auth path) — offered as an option, not chosen.</w:t>
+      </w:r>
+    </w:p>
+    <w:p>
+      <w:pPr>
+        <w:pStyle w:val="25"/>
+      </w:pPr>
+      <w:r>
+        <w:t>Revenue display: build the real aggregation now, showing an honest $0 / “no billing activity yet” state, rather than omitting the panel — so it is correct the moment real invoicing exists, with zero further backend work needed then.</w:t>
+      </w:r>
+    </w:p>
+    <w:p>
+      <w:pPr>
+        <w:pStyle w:val="25"/>
+      </w:pPr>
+      <w:r>
+        <w:t>Test accounts: explicitly no real emails for the client or the Jenex team were added this session — verified instead against the existing test-admin@example.com / a@a.com admin account already in the system (Appendix C). Production access is just creating a normal fl_users row with role = 'admin' via the same manual-linking process already documented in Section 5.6 — no code changes needed to go live with real people.</w:t>
+      </w:r>
+    </w:p>
+    <w:p>
+      <w:pPr>
+        <w:pStyle w:val="25"/>
+      </w:pPr>
+      <w:r>
+        <w:t>KB review scope: real approve/reject actions built into the panel, not just a read-only queue — for contractor submissions specifically (Section 11.4); the scripts remain the review path for the original bulk-CSV-import content.</w:t>
+      </w:r>
+    </w:p>
+    <w:p>
+      <w:pPr>
+        <w:pStyle w:val="3"/>
+      </w:pPr>
+      <w:r>
+        <w:t>13.4 What was built — first pass</w:t>
+      </w:r>
+    </w:p>
+    <w:p>
+      <w:pPr/>
+      <w:r>
+        <w:t>Four new Lambdas, all requireRole(event, ['admin']) plus enforceIpAllowlist, the same pattern as terminate-contractor / save-contractor-financials:</w:t>
+      </w:r>
+    </w:p>
+    <w:p>
+      <w:pPr>
+        <w:pStyle w:val="25"/>
+      </w:pPr>
+      <w:r>
+        <w:t>get-platform-overview (POST /platform/overview) — every KPI aggregated in application code over full-table selects (the same approach list-jobs's conflict-detection logic already uses rather than pushing aggregation into SQL, since these tables are small): contractor status breakdown including the missing-row bucket, technician/job counts, revenue from the real invoices table, compliance expirations (license/GL insurance within 60 days or already expired, across every contractor), and Knowledge Base stats (status counts, per-trade approved-content coverage, contractor-submission counts).</w:t>
+      </w:r>
+    </w:p>
+    <w:p>
+      <w:pPr>
+        <w:pStyle w:val="25"/>
+      </w:pPr>
+      <w:r>
+        <w:t>list-platform-contractors (POST /platform/contractors) — every contractor, left-joined to status/trade/job-count/active-technician-count in one call. Distinct from the existing list-contractors (a 50-row name-search picker for loading one contractor into the registration wizard) — this one is built for browsing/reporting on all of them at once, not searching for one.</w:t>
+      </w:r>
+    </w:p>
+    <w:p>
+      <w:pPr>
+        <w:pStyle w:val="25"/>
+      </w:pPr>
+      <w:r>
+        <w:t>list-kb-submissions-admin (POST /kb/admin/submissions) — every contractor's KB submissions (created_by set — the bulk importer never sets this column, a reliable way to isolate contractor submissions from the original 500-fact import), with the submitting contractor's name resolved via contractor_users.id → contractors.legal_name (no foreign key, a manual lookup, the same pattern used for ownership checks in Section 8.6).</w:t>
+      </w:r>
+    </w:p>
+    <w:p>
+      <w:pPr>
+        <w:pStyle w:val="25"/>
+      </w:pPr>
+      <w:r>
+        <w:t>review-kb-submission (POST /kb/admin/review) — approves or rejects one entry at a time. Two real guards, both verified live: refuses to act on a row that is not a contractor submission (created_by null, i.e. the bulk import), and refuses to act on a row that is not currently pending (already decided).</w:t>
+      </w:r>
+    </w:p>
+    <w:p>
+      <w:pPr/>
+      <w:r>
+        <w:t>Frontend: a new PlatformAdminDashboard.jsx, reachable at /staff/platform, gated both by a nav link only rendered for role === 'admin' in RegistrationDashboard.jsx's header and a route-level redirect in App.jsx for anyone who navigates there directly without the role — verified live that a non-admin (onboarding role) login sees neither the link nor can reach the page by URL. Reuses command-dashboard/dashboard.css rather than inventing a third design system — registration-dashboard's own registration.css turned out to be unused leftover Vite-template CSS; the real staff styling lives in shared/styles/global.css, which has no KPI/panel/table components at all, while dashboard.css already has exactly this shape, already proven in ContractorCommandDashboard.jsx.</w:t>
+      </w:r>
+    </w:p>
+    <w:p>
+      <w:pPr>
+        <w:pStyle w:val="4"/>
+      </w:pPr>
+      <w:r>
+        <w:t>Problem encountered: reused CSS hid every panel below the KPI row</w:t>
+      </w:r>
+    </w:p>
+    <w:p>
+      <w:pPr/>
+      <w:r>
+        <w:t>dashboard.css hides every .dash-panel by default and only shows one under a matching .page-N .section-N pair — a mechanism built for ContractorCommandDashboard's sidebar page-switcher. This first version of the new page had no sidebar/page-switcher at all, so every panel below the KPI row rendered completely invisible on first load — caught via a full-page screenshot during verification (the KPI grid showed real data; everything below it was blank). Fixed at the time by hardcoding page-1/section-1 onto the shell and every panel, since there was only ever one “page” in that first version; Section 13.6 below replaces that hardcode with a real tab mechanism.</w:t>
+      </w:r>
+    </w:p>
+    <w:p>
+      <w:pPr>
+        <w:pStyle w:val="3"/>
+      </w:pPr>
+      <w:r>
+        <w:t>13.5 What was tested — first pass (real, live — not just code review)</w:t>
+      </w:r>
+    </w:p>
+    <w:p>
+      <w:pPr>
+        <w:pStyle w:val="25"/>
+      </w:pPr>
+      <w:r>
+        <w:t>All four endpoints called live as the real test-admin@example.com / a@a.com account: platform/overview and platform/contractors returned real numbers matching a direct database check (19 contractors, 9 active / 6 pending / 4 missing-status, 14 of 15 active technicians, 59 jobs with a real status breakdown, $0 revenue).</w:t>
+      </w:r>
+    </w:p>
+    <w:p>
+      <w:pPr>
+        <w:pStyle w:val="25"/>
+      </w:pPr>
+      <w:r>
+        <w:t>review-kb-submission guard-tested both directions: attempting to approve a bulk-imported row (created_by = null) correctly returned 400 (“not a contractor submission”); attempting to re-approve an already-approved row correctly returned 400 (“already 'approved', not pending”).</w:t>
+      </w:r>
+    </w:p>
+    <w:p>
+      <w:pPr>
+        <w:pStyle w:val="25"/>
+      </w:pPr>
+      <w:r>
+        <w:t>Full loop tested twice — once at the API level (submit → appears in the admin queue with the correct submitter name → approve → status flips), once in a real Playwright-driven browser (seeded a real pending submission, logged in as admin, saw it in the pending-submissions panel, clicked Approve, saw the toast, confirmed the row disappeared without a page reload).</w:t>
+      </w:r>
+    </w:p>
+    <w:p>
+      <w:pPr>
+        <w:pStyle w:val="25"/>
+      </w:pPr>
+      <w:r>
+        <w:t>Role gating verified in a real browser both ways: onboarding-role login shows no “Platform Overview” link and is redirected away from /staff/platform on direct navigation; admin-role login sees the link and lands on a fully-populated page. Zero console errors.</w:t>
+      </w:r>
+    </w:p>
+    <w:p>
+      <w:pPr>
+        <w:pStyle w:val="3"/>
+      </w:pPr>
+      <w:r>
+        <w:t>13.6 UI/UX rework — real tabs and a contractor drill-down</w:t>
+      </w:r>
+    </w:p>
+    <w:p>
+      <w:pPr/>
+      <w:r>
+        <w:t>The project owner reviewed the first version directly and flagged it as a real design problem, not a small tweak: it looked static (flat panels, no interactive tables), there was no way to click into a specific contractor, and every section (contractor list, usage, revenue, and the rest) was crammed onto one page instead of being organized into distinct views. A design pass was planned first — tab/navigation structure, a data-visualization approach, drill-down data and fetching, technical scope, and a phasing order — confirmed, then built.</w:t>
+      </w:r>
+    </w:p>
+    <w:p>
+      <w:pPr>
+        <w:pStyle w:val="4"/>
+      </w:pPr>
+      <w:r>
+        <w:t>Real tab structure</w:t>
+      </w:r>
+    </w:p>
+    <w:p>
+      <w:pPr/>
+      <w:r>
+        <w:t>ContractorCommandDashboard.jsx already has a proven tab pattern: a numbered sidebar plus the same .page-N .section-N CSS mechanism whose display:none default had been worked around with a hardcode in the first version above. That hardcode was replaced with the real mechanism it was always meant to be: a genuine activeTab state and a sidebar with five real tabs — Overview, Contractors, Usage, Revenue, Knowledge Base — each panel tagged with the section number matching its tab. Overview became the “what needs my attention” landing view (the KPI row plus a compact alert strip — missing-status contractors, compliance expiring, pending KB submissions — each alert a button that jumps straight to the tab that resolves it) rather than also trying to be a full data browser. Contractors became its own tab specifically because it is the primary workflow, not a panel fighting five others for space. Usage and Revenue were split apart specifically so a still-genuinely-$0 revenue panel does not visually compete with panels that do have real data. Knowledge Base keeps content-coverage and the review queue together since both describe the current state of the KB.</w:t>
+      </w:r>
+    </w:p>
+    <w:p>
+      <w:pPr/>
+      <w:r>
+        <w:t>The contractor table became sortable (click any column header to toggle ascending/descending) and every row became clickable, navigating to the new drill-down route below.</w:t>
+      </w:r>
+    </w:p>
+    <w:p>
+      <w:pPr>
+        <w:pStyle w:val="4"/>
+      </w:pPr>
+      <w:r>
+        <w:t>Contractor drill-down — a real route, not a modal</w:t>
+      </w:r>
+    </w:p>
+    <w:p>
+      <w:pPr/>
+      <w:r>
+        <w:t>/staff/platform/contractors/:id, gated by the identical admin-only pattern as /staff/platform. A route was chosen over a modal because the payload is large (profile, compliance, financials, audit log, plus full operational usage) and this codebase's existing convention for viewing a full record is a full page (the Registration Dashboard itself), not a modal — modals here are reserved for quick actions (Add Technician, Create Job), not record browsing. A route is also bookmarkable and shareable between staff, which a modal state is not.</w:t>
+      </w:r>
+    </w:p>
+    <w:p>
+      <w:pPr/>
+      <w:r>
+        <w:t>Data sourcing needed one endpoint reused and one new one built. get-contractor (existing, already used by the Registration Dashboard) already returns everything profile-shaped for an admin, unmasked — contractor identity, compliance, operations, financials, meta, and the last 8 access_audit_log rows — reused here completely as-is, zero backend changes. It does not return operational usage (that contractor's actual jobs, technicians, invoices, KB submissions) — nothing in this repository returned that scoped to one contractor from the admin side, so a new Lambda, get-platform-contractor-usage (POST /platform/contractors/usage, admin-only), was built specifically for that gap: real jobs (direct contractor_id filter), technicians (same), invoices/estimates (joined through jobs, the same two-query pattern list-invoices/list-estimates already use), and KB submissions (resolved via contractor_users.id → contractor_id, the same lookup shape list-kb-submissions-admin already uses).</w:t>
+      </w:r>
+    </w:p>
+    <w:p>
+      <w:pPr>
+        <w:pStyle w:val="4"/>
+      </w:pPr>
+      <w:r>
+        <w:t>Problem encountered while testing this: every tab's panels stay mounted in the DOM</w:t>
+      </w:r>
+    </w:p>
+    <w:p>
+      <w:pPr/>
+      <w:r>
+        <w:t>Because every tab's panels stay mounted (just hidden via CSS, the same architecture ContractorCommandDashboard.jsx already uses), a test locator like “find the row containing this contractor's name” matched three different rows across three different tabs simultaneously — the roster table, the missing-status table, and the most-active-contractors table on the Usage tab all independently contain that contractor's name in the DOM at the same time. This is expected/correct given the architecture, not an application bug, but it means any test script against this page has to scope its locators to the visible tab's section, the same lesson this project's testing already learned once before on ContractorCommandDashboard.jsx (Section 7.4, Round 2's race-condition finding).</w:t>
+      </w:r>
+    </w:p>
+    <w:p>
+      <w:pPr>
+        <w:pStyle w:val="3"/>
+      </w:pPr>
+      <w:r>
+        <w:t>13.7 What was tested — UI/UX rework (real, live — not just code review)</w:t>
+      </w:r>
+    </w:p>
+    <w:p>
+      <w:pPr>
+        <w:pStyle w:val="25"/>
+      </w:pPr>
+      <w:r>
+        <w:t>New Lambda smoke-tested directly against the real “Luxe renovation” contractor (the one account with actual usage among the mostly-test-data 19 contractors) — returned 35 real jobs, 1 real technician, 0 invoices/estimates/KB submissions (accurate — that contractor has not touched those features).</w:t>
+      </w:r>
+    </w:p>
+    <w:p>
+      <w:pPr>
+        <w:pStyle w:val="25"/>
+      </w:pPr>
+      <w:r>
+        <w:t>Full browser flow: logged in as admin, opened Platform Overview, clicked through all 5 tabs and confirmed each shows its own distinct panel set, sorted the contractor table by the Jobs column (confirmed a 0-job contractor sorted first ascending), clicked into “Luxe renovation,” landed on the correct drill-down URL, confirmed the Jobs panel rendered real job rows (real customer names, real statuses/dates), then navigated back cleanly. Zero console errors throughout.</w:t>
+      </w:r>
+    </w:p>
+    <w:p>
+      <w:pPr>
+        <w:pStyle w:val="25"/>
+      </w:pPr>
+      <w:r>
+        <w:t>Confirmed visually (full-page screenshot) that Financials, Compliance, Technicians, Jobs, Invoices &amp; estimates, KB submissions, and Recent staff activity all render correctly on the drill-down page, including honest empty states for the two panels with no data yet for that particular contractor.</w:t>
+      </w:r>
+    </w:p>
+    <w:p>
+      <w:pPr>
+        <w:pStyle w:val="3"/>
+      </w:pPr>
+      <w:r>
+        <w:t>13.8 Explicitly deferred (not built this pass)</w:t>
+      </w:r>
+    </w:p>
+    <w:p>
+      <w:pPr/>
+      <w:r>
+        <w:t>Charts / data-visualization was flagged during planning as a real open decision — hand-rolled SVG, matching this codebase's zero-new-frontend-dependency pattern so far, versus a small charting library for faster and better-looking results for more chart types — and was not resolved before the project owner said to proceed, so it was held for a later pass per the agreed phasing (structure → drill-down → visualization → polish) rather than guessed at. A loading-skeleton / hover-polish pass was deferred for the same reason.</w:t>
+      </w:r>
+      <w:r>
+        <w:t xml:space="preserve"> Both built in the very next pass — see Section 13.10.</w:t>
+      </w:r>
+    </w:p>
+    <w:p>
+      <w:pPr>
+        <w:pStyle w:val="3"/>
+      </w:pPr>
+      <w:r>
+        <w:t>13.9 Files</w:t>
+      </w:r>
+    </w:p>
+    <w:p>
+      <w:pPr/>
+      <w:r>
+        <w:t>backend/functions/get-platform-overview/, list-platform-contractors/, list-kb-submissions-admin/, review-kb-submission/, get-platform-contractor-usage/ (new Lambdas, deployed); backend/functions/package-lambda.ps1 (ValidateSet updated); src/registration-dashboard/PlatformAdminDashboard.jsx (new, then rewritten for real tabs); src/registration-dashboard/PlatformContractorDetail.jsx (new — the drill-down page); src/App.jsx (/staff/platform and /staff/platform/contractors/:id routes, both admin-only); src/registration-dashboard/RegistrationDashboard.jsx (admin-only nav link added); src/shared/services/api.js (getPlatformOverview, listPlatformContractors, listKbSubmissionsAdmin, reviewKbSubmission, getPlatformContractorUsage added); src/command-dashboard/dashboard.css (.clickable-row:hover added).</w:t>
+      </w:r>
+    </w:p>
+    <w:p>
+      <w:pPr>
+        <w:pStyle w:val="3"/>
+      </w:pPr>
+      <w:r>
+        <w:t>13.10 Polish Pass — Hand-Rolled Charts and Loading Skeletons</w:t>
+      </w:r>
+    </w:p>
+    <w:p>
+      <w:pPr>
+        <w:pStyle w:val="4"/>
+      </w:pPr>
+      <w:r>
+        <w:t>Design method</w:t>
+      </w:r>
+    </w:p>
+    <w:p>
+      <w:pPr/>
+      <w:r>
+        <w:t>Built following this workspace's dataviz skill rather than styling charts by eye — the skill's procedure (pick the form, then assign color by the job it does, validate, apply mark specs, add a hover layer, run an accessibility pass, then actually look at the render) was followed in order, form chosen before color, color last.</w:t>
+      </w:r>
+    </w:p>
+    <w:p>
+      <w:pPr>
+        <w:pStyle w:val="25"/>
+      </w:pPr>
+      <w:r>
+        <w:t>Contractor status (active/pending/suspended/terminated/no_status) is a part-to-whole job → a horizontal stacked bar, not a donut/pie — the skill's form guidance explicitly rules out a donut/pie here and separately flags a 2-slice pie as a straight anti-pattern. Colors come from the skill's status palette, not its categorical theme, because this data genuinely is state, not arbitrary series identity: active = good, suspended = warning, terminated = critical. 'Pending' and 'no_status' aren't good/bad, so they deliberately stay off the status scale — pending takes the categorical theme's slot-1 blue (neutral/informational), no_status (a data-quality gap, not a real business state) stays a plain muted gray.</w:t>
+      </w:r>
+    </w:p>
+    <w:p>
+      <w:pPr>
+        <w:pStyle w:val="25"/>
+      </w:pPr>
+      <w:r>
+        <w:t>Jobs by status is a magnitude-comparison job, but jobs.status has a real lifecycle order (verified live via probe-insert, Section 5.2/8.2: draft → scheduled → en_route → on_site → complete → closed → invoiced → paid) — so it is ordinal, not nominal, and gets the skill's ordinal ramp: one hue (blue), monotone lightness by stage. All 8 lifecycle stages render every time, including the 5 currently at zero — an honest, complete funnel rather than only showing the 3 stages with real data today.</w:t>
+      </w:r>
+    </w:p>
+    <w:p>
+      <w:pPr>
+        <w:pStyle w:val="25"/>
+      </w:pPr>
+      <w:r>
+        <w:t>KB content coverage by trade is one series across nominal categories (trades have no natural order) → every bar takes the same categorical slot-1 hue; magnitude is bar length only. Coloring nominal bars by their own value was explicitly avoided — the skill documents this as a real anti-pattern (it double-encodes bar length as hue and burns the identity channel on information the chart already shows).</w:t>
+      </w:r>
+    </w:p>
+    <w:p>
+      <w:pPr/>
+      <w:r>
+        <w:t>Hover tooltips: value leads (bold), label follows (secondary), per the skill's tooltip hierarchy — the opposite order from a legend. Implemented as pure CSS (:hover/:focus-visible on a tabindex="0" wrapper revealing an absolutely-positioned tooltip), so keyboard focus gets the identical tooltip to mouse hover with no extra JS state, and every chart sits directly beside or above the data table it summarizes — the skill's required table-view twin already existed in every case, nothing new needed there.</w:t>
+      </w:r>
+    </w:p>
+    <w:p>
+      <w:pPr/>
+      <w:r>
+        <w:t>No categorical-palette validator run was needed — none of the three charts assign a fresh multi-hue categorical palette (status colors are pre-validated and fixed by the skill's own rules; the two ordinal/single-hue charts are explicitly outside the categorical validator's scope, per the skill's own documentation of what it does and doesn't check).</w:t>
+      </w:r>
+    </w:p>
+    <w:p>
+      <w:pPr>
+        <w:pStyle w:val="4"/>
+      </w:pPr>
+      <w:r>
+        <w:t>Loading skeletons</w:t>
+      </w:r>
+    </w:p>
+    <w:p>
+      <w:pPr/>
+      <w:r>
+        <w:t>.loading-roster, used everywhere on this page, turned out to have zero CSS anywhere in the codebase — confirmed by a direct search — meaning every “Loading…” state on this page and on the pattern it copied from ContractorCommandDashboard.jsx was always just unstyled plain text. New skeleton classes (a CSS @keyframes opacity pulse, no JS animation) replace the plain text on the KPI row, the contractor roster table, the Overview/Usage panels, and the pending-KB-submissions list while their real requests are in flight.</w:t>
+      </w:r>
+    </w:p>
+    <w:p>
+      <w:pPr>
+        <w:pStyle w:val="4"/>
+      </w:pPr>
+      <w:r>
+        <w:t>What was tested (real, live — not just code review)</w:t>
+      </w:r>
+    </w:p>
+    <w:p>
+      <w:pPr>
+        <w:pStyle w:val="25"/>
+      </w:pPr>
+      <w:r>
+        <w:t>Build/lint clean; zero new frontend dependencies added (confirmed against package.json).</w:t>
+      </w:r>
+    </w:p>
+    <w:p>
+      <w:pPr>
+        <w:pStyle w:val="25"/>
+      </w:pPr>
+      <w:r>
+        <w:t>Real browser (Playwright): screenshotted all three charts fully rendered with real data (the stacked bar's true 9/6/0/0/4 split; the ordinal ramp visibly lightening toward the earlier lifecycle stages; the KB single-hue bar showing the real 500/0/0/0 split) — checked against the skill's own “render it and look at it” step, not just trusted from the code.</w:t>
+      </w:r>
+    </w:p>
+    <w:p>
+      <w:pPr>
+        <w:pStyle w:val="25"/>
+      </w:pPr>
+      <w:r>
+        <w:t>Hovered a live segment on the stacked bar and confirmed the tooltip rendered with the correct value-leads-label-follows hierarchy and the correct percentage.</w:t>
+      </w:r>
+    </w:p>
+    <w:p>
+      <w:pPr>
+        <w:pStyle w:val="25"/>
+      </w:pPr>
+      <w:r>
+        <w:t>Confirmed the loading skeleton actually renders, not just that the conditional logic looks right: throttled the network via a real Chrome DevTools Protocol session immediately before navigating to the page and screenshotted mid-load — five pulsing KPI placeholders and panel skeleton lines, not blank space or a layout jump.</w:t>
+      </w:r>
+    </w:p>
+    <w:p>
+      <w:pPr>
+        <w:pStyle w:val="25"/>
+      </w:pPr>
+      <w:r>
+        <w:t>Zero console errors across every screenshot.</w:t>
+      </w:r>
+    </w:p>
+    <w:p>
+      <w:pPr>
+        <w:pStyle w:val="4"/>
+      </w:pPr>
+      <w:r>
+        <w:t>Files</w:t>
+      </w:r>
+    </w:p>
+    <w:p>
+      <w:pPr/>
+      <w:r>
+        <w:t>src/command-dashboard/dashboard.css (chart-tooltip, chart-hoverable, stacked-bar/stacked-bar-segment, chart-legend, hbar-chart/hbar-row/hbar-track/hbar-fill, and the skeleton classes all added); src/registration-dashboard/PlatformAdminDashboard.jsx (ChartHoverable, StatusStackedBar, HorizontalBarChart, SkeletonKpiRow, SkeletonLines components added; wired into the Overview, Usage, and Knowledge Base tabs; every “Loading…” text state replaced with a skeleton).</w:t>
       </w:r>
     </w:p>
     <w:p>
@@ -13299,6 +14132,266 @@
           </w:p>
         </w:tc>
       </w:tr>
+      <w:tr>
+        <w:tc>
+          <w:tcPr>
+            <w:tcW w:type="dxa" w:w="1217"/>
+          </w:tcPr>
+          <w:p>
+            <w:r>
+              <w:t>get-platform-overview</w:t>
+            </w:r>
+          </w:p>
+        </w:tc>
+        <w:tc>
+          <w:tcPr>
+            <w:tcW w:type="dxa" w:w="1217"/>
+          </w:tcPr>
+          <w:p>
+            <w:r>
+              <w:t>fieldloop-get-platform-overview</w:t>
+            </w:r>
+          </w:p>
+        </w:tc>
+        <w:tc>
+          <w:tcPr>
+            <w:tcW w:type="dxa" w:w="2208"/>
+          </w:tcPr>
+          <w:p>
+            <w:r>
+              <w:t>POST /platform/overview</w:t>
+            </w:r>
+          </w:p>
+        </w:tc>
+        <w:tc>
+          <w:tcPr>
+            <w:tcW w:type="dxa" w:w="1276"/>
+          </w:tcPr>
+          <w:p>
+            <w:r>
+              <w:t>admin only</w:t>
+            </w:r>
+          </w:p>
+        </w:tc>
+        <w:tc>
+          <w:tcPr>
+            <w:tcW w:type="dxa" w:w="2938"/>
+          </w:tcPr>
+          <w:p>
+            <w:r>
+              <w:t>Section 13.4 — cross-contractor KPIs: contractor status breakdown (incl. contractors with no contractor_system_meta row), technician/job counts, real revenue (honest $0 until real invoicing exists), compliance expirations, KB content/submission stats</w:t>
+            </w:r>
+          </w:p>
+        </w:tc>
+      </w:tr>
+      <w:tr>
+        <w:tc>
+          <w:tcPr>
+            <w:tcW w:type="dxa" w:w="1217"/>
+          </w:tcPr>
+          <w:p>
+            <w:r>
+              <w:t>list-platform-contractors</w:t>
+            </w:r>
+          </w:p>
+        </w:tc>
+        <w:tc>
+          <w:tcPr>
+            <w:tcW w:type="dxa" w:w="1217"/>
+          </w:tcPr>
+          <w:p>
+            <w:r>
+              <w:t>fieldloop-list-platform-contractors</w:t>
+            </w:r>
+          </w:p>
+        </w:tc>
+        <w:tc>
+          <w:tcPr>
+            <w:tcW w:type="dxa" w:w="2208"/>
+          </w:tcPr>
+          <w:p>
+            <w:r>
+              <w:t>POST /platform/contractors</w:t>
+            </w:r>
+          </w:p>
+        </w:tc>
+        <w:tc>
+          <w:tcPr>
+            <w:tcW w:type="dxa" w:w="1276"/>
+          </w:tcPr>
+          <w:p>
+            <w:r>
+              <w:t>admin only</w:t>
+            </w:r>
+          </w:p>
+        </w:tc>
+        <w:tc>
+          <w:tcPr>
+            <w:tcW w:type="dxa" w:w="2938"/>
+          </w:tcPr>
+          <w:p>
+            <w:r>
+              <w:t>Section 13.4 — every contractor on the platform with status/trade/usage counts in one call, unlike list-contractors’ 50-row name-search picker</w:t>
+            </w:r>
+          </w:p>
+        </w:tc>
+      </w:tr>
+      <w:tr>
+        <w:tc>
+          <w:tcPr>
+            <w:tcW w:type="dxa" w:w="1217"/>
+          </w:tcPr>
+          <w:p>
+            <w:r>
+              <w:t>list-kb-submissions-admin</w:t>
+            </w:r>
+          </w:p>
+        </w:tc>
+        <w:tc>
+          <w:tcPr>
+            <w:tcW w:type="dxa" w:w="1217"/>
+          </w:tcPr>
+          <w:p>
+            <w:r>
+              <w:t>fieldloop-list-kb-submissions-admin</w:t>
+            </w:r>
+          </w:p>
+        </w:tc>
+        <w:tc>
+          <w:tcPr>
+            <w:tcW w:type="dxa" w:w="2208"/>
+          </w:tcPr>
+          <w:p>
+            <w:r>
+              <w:t>POST /kb/admin/submissions</w:t>
+            </w:r>
+          </w:p>
+        </w:tc>
+        <w:tc>
+          <w:tcPr>
+            <w:tcW w:type="dxa" w:w="1276"/>
+          </w:tcPr>
+          <w:p>
+            <w:r>
+              <w:t>admin only</w:t>
+            </w:r>
+          </w:p>
+        </w:tc>
+        <w:tc>
+          <w:tcPr>
+            <w:tcW w:type="dxa" w:w="2938"/>
+          </w:tcPr>
+          <w:p>
+            <w:r>
+              <w:t>Section 13.4 — every contractor’s KB submissions (not just one contractor’s), optional status filter</w:t>
+            </w:r>
+          </w:p>
+        </w:tc>
+      </w:tr>
+      <w:tr>
+        <w:tc>
+          <w:tcPr>
+            <w:tcW w:type="dxa" w:w="1217"/>
+          </w:tcPr>
+          <w:p>
+            <w:r>
+              <w:t>review-kb-submission</w:t>
+            </w:r>
+          </w:p>
+        </w:tc>
+        <w:tc>
+          <w:tcPr>
+            <w:tcW w:type="dxa" w:w="1217"/>
+          </w:tcPr>
+          <w:p>
+            <w:r>
+              <w:t>fieldloop-review-kb-submission</w:t>
+            </w:r>
+          </w:p>
+        </w:tc>
+        <w:tc>
+          <w:tcPr>
+            <w:tcW w:type="dxa" w:w="2208"/>
+          </w:tcPr>
+          <w:p>
+            <w:r>
+              <w:t>POST /kb/admin/review</w:t>
+            </w:r>
+          </w:p>
+        </w:tc>
+        <w:tc>
+          <w:tcPr>
+            <w:tcW w:type="dxa" w:w="1276"/>
+          </w:tcPr>
+          <w:p>
+            <w:r>
+              <w:t>admin only</w:t>
+            </w:r>
+          </w:p>
+        </w:tc>
+        <w:tc>
+          <w:tcPr>
+            <w:tcW w:type="dxa" w:w="2938"/>
+          </w:tcPr>
+          <w:p>
+            <w:r>
+              <w:t>Section 13.4 — approve/reject a single contractor-submitted KB fact; refuses to act on a non-submission row or an already-decided one</w:t>
+            </w:r>
+          </w:p>
+        </w:tc>
+      </w:tr>
+      <w:tr>
+        <w:tc>
+          <w:tcPr>
+            <w:tcW w:type="dxa" w:w="1217"/>
+          </w:tcPr>
+          <w:p>
+            <w:r>
+              <w:t>get-platform-contractor-usage</w:t>
+            </w:r>
+          </w:p>
+        </w:tc>
+        <w:tc>
+          <w:tcPr>
+            <w:tcW w:type="dxa" w:w="1217"/>
+          </w:tcPr>
+          <w:p>
+            <w:r>
+              <w:t>fieldloop-get-platform-contractor-usage</w:t>
+            </w:r>
+          </w:p>
+        </w:tc>
+        <w:tc>
+          <w:tcPr>
+            <w:tcW w:type="dxa" w:w="2208"/>
+          </w:tcPr>
+          <w:p>
+            <w:r>
+              <w:t>POST /platform/contractors/usage</w:t>
+            </w:r>
+          </w:p>
+        </w:tc>
+        <w:tc>
+          <w:tcPr>
+            <w:tcW w:type="dxa" w:w="1276"/>
+          </w:tcPr>
+          <w:p>
+            <w:r>
+              <w:t>admin only</w:t>
+            </w:r>
+          </w:p>
+        </w:tc>
+        <w:tc>
+          <w:tcPr>
+            <w:tcW w:type="dxa" w:w="2938"/>
+          </w:tcPr>
+          <w:p>
+            <w:r>
+              <w:t>Section 13.6 — one contractor’s real jobs/technicians/invoices/estimates/KB submissions, for the Platform Overview’s contractor drill-down. Complements get-contractor (profile/compliance/financials/audit-log), which this Lambda deliberately does not duplicate</w:t>
+            </w:r>
+          </w:p>
+        </w:tc>
+      </w:tr>
     </w:tbl>
     <w:p/>
     <w:p>
@@ -14638,6 +15731,318 @@
           </w:p>
         </w:tc>
       </w:tr>
+      <w:tr>
+        <w:tc>
+          <w:tcPr>
+            <w:tcW w:type="dxa" w:w="1727"/>
+          </w:tcPr>
+          <w:p>
+            <w:r>
+              <w:t>get-job-file</w:t>
+            </w:r>
+          </w:p>
+        </w:tc>
+        <w:tc>
+          <w:tcPr>
+            <w:tcW w:type="dxa" w:w="1727"/>
+          </w:tcPr>
+          <w:p>
+            <w:r>
+              <w:t>fieldloop-get-job-file</w:t>
+            </w:r>
+          </w:p>
+        </w:tc>
+        <w:tc>
+          <w:tcPr>
+            <w:tcW w:type="dxa" w:w="1946"/>
+          </w:tcPr>
+          <w:p>
+            <w:r>
+              <w:t>POST /jobs/job-file</w:t>
+            </w:r>
+          </w:p>
+        </w:tc>
+        <w:tc>
+          <w:tcPr>
+            <w:tcW w:type="dxa" w:w="1728"/>
+          </w:tcPr>
+          <w:p>
+            <w:r>
+              <w:t>owner_admin</w:t>
+            </w:r>
+          </w:p>
+        </w:tc>
+        <w:tc>
+          <w:tcPr>
+            <w:tcW w:type="dxa" w:w="1728"/>
+          </w:tcPr>
+          <w:p>
+            <w:r>
+              <w:t>Section 8.7 — returns one job’s real field_events timeline (written by the technician mobile app), ownership-checked. Backs the “View job file” dispatch-board action</w:t>
+            </w:r>
+          </w:p>
+        </w:tc>
+      </w:tr>
+      <w:tr>
+        <w:tc>
+          <w:tcPr>
+            <w:tcW w:type="dxa" w:w="1727"/>
+          </w:tcPr>
+          <w:p>
+            <w:r>
+              <w:t>list-invoices</w:t>
+            </w:r>
+          </w:p>
+        </w:tc>
+        <w:tc>
+          <w:tcPr>
+            <w:tcW w:type="dxa" w:w="1727"/>
+          </w:tcPr>
+          <w:p>
+            <w:r>
+              <w:t>fieldloop-list-invoices</w:t>
+            </w:r>
+          </w:p>
+        </w:tc>
+        <w:tc>
+          <w:tcPr>
+            <w:tcW w:type="dxa" w:w="1946"/>
+          </w:tcPr>
+          <w:p>
+            <w:r>
+              <w:t>POST /invoices/list</w:t>
+            </w:r>
+          </w:p>
+        </w:tc>
+        <w:tc>
+          <w:tcPr>
+            <w:tcW w:type="dxa" w:w="1728"/>
+          </w:tcPr>
+          <w:p>
+            <w:r>
+              <w:t>owner_admin</w:t>
+            </w:r>
+          </w:p>
+        </w:tc>
+        <w:tc>
+          <w:tcPr>
+            <w:tcW w:type="dxa" w:w="1728"/>
+          </w:tcPr>
+          <w:p>
+            <w:r>
+              <w:t>Section 8.6 — read-only. Lists real invoices (joined through jobs), status derived from invoice_number/paid_ts (no status column exists)</w:t>
+            </w:r>
+          </w:p>
+        </w:tc>
+      </w:tr>
+      <w:tr>
+        <w:tc>
+          <w:tcPr>
+            <w:tcW w:type="dxa" w:w="1727"/>
+          </w:tcPr>
+          <w:p>
+            <w:r>
+              <w:t>list-estimates</w:t>
+            </w:r>
+          </w:p>
+        </w:tc>
+        <w:tc>
+          <w:tcPr>
+            <w:tcW w:type="dxa" w:w="1727"/>
+          </w:tcPr>
+          <w:p>
+            <w:r>
+              <w:t>fieldloop-list-estimates</w:t>
+            </w:r>
+          </w:p>
+        </w:tc>
+        <w:tc>
+          <w:tcPr>
+            <w:tcW w:type="dxa" w:w="1946"/>
+          </w:tcPr>
+          <w:p>
+            <w:r>
+              <w:t>POST /estimates/list</w:t>
+            </w:r>
+          </w:p>
+        </w:tc>
+        <w:tc>
+          <w:tcPr>
+            <w:tcW w:type="dxa" w:w="1728"/>
+          </w:tcPr>
+          <w:p>
+            <w:r>
+              <w:t>owner_admin</w:t>
+            </w:r>
+          </w:p>
+        </w:tc>
+        <w:tc>
+          <w:tcPr>
+            <w:tcW w:type="dxa" w:w="1728"/>
+          </w:tcPr>
+          <w:p>
+            <w:r>
+              <w:t>Section 8.6 — read-only. Lists real estimates/change orders (same join-through-jobs pattern)</w:t>
+            </w:r>
+          </w:p>
+        </w:tc>
+      </w:tr>
+      <w:tr>
+        <w:tc>
+          <w:tcPr>
+            <w:tcW w:type="dxa" w:w="1727"/>
+          </w:tcPr>
+          <w:p>
+            <w:r>
+              <w:t>update-estimate</w:t>
+            </w:r>
+          </w:p>
+        </w:tc>
+        <w:tc>
+          <w:tcPr>
+            <w:tcW w:type="dxa" w:w="1727"/>
+          </w:tcPr>
+          <w:p>
+            <w:r>
+              <w:t>fieldloop-update-estimate</w:t>
+            </w:r>
+          </w:p>
+        </w:tc>
+        <w:tc>
+          <w:tcPr>
+            <w:tcW w:type="dxa" w:w="1946"/>
+          </w:tcPr>
+          <w:p>
+            <w:r>
+              <w:t>POST /estimates/update</w:t>
+            </w:r>
+          </w:p>
+        </w:tc>
+        <w:tc>
+          <w:tcPr>
+            <w:tcW w:type="dxa" w:w="1728"/>
+          </w:tcPr>
+          <w:p>
+            <w:r>
+              <w:t>owner_admin</w:t>
+            </w:r>
+          </w:p>
+        </w:tc>
+        <w:tc>
+          <w:tcPr>
+            <w:tcW w:type="dxa" w:w="1728"/>
+          </w:tcPr>
+          <w:p>
+            <w:r>
+              <w:t>Section 8.6 — the contractor’s only write action on this table: approve or reject an estimate/change order the customer has already e-signed (status = ‘signed’ required going in). Stamps owner_approved_ts/owner_approved_by on approval</w:t>
+            </w:r>
+          </w:p>
+        </w:tc>
+      </w:tr>
+      <w:tr>
+        <w:tc>
+          <w:tcPr>
+            <w:tcW w:type="dxa" w:w="1727"/>
+          </w:tcPr>
+          <w:p>
+            <w:r>
+              <w:t>submit-kb-entry</w:t>
+            </w:r>
+          </w:p>
+        </w:tc>
+        <w:tc>
+          <w:tcPr>
+            <w:tcW w:type="dxa" w:w="1727"/>
+          </w:tcPr>
+          <w:p>
+            <w:r>
+              <w:t>fieldloop-submit-kb-entry</w:t>
+            </w:r>
+          </w:p>
+        </w:tc>
+        <w:tc>
+          <w:tcPr>
+            <w:tcW w:type="dxa" w:w="1946"/>
+          </w:tcPr>
+          <w:p>
+            <w:r>
+              <w:t>POST /kb/submit</w:t>
+            </w:r>
+          </w:p>
+        </w:tc>
+        <w:tc>
+          <w:tcPr>
+            <w:tcW w:type="dxa" w:w="1728"/>
+          </w:tcPr>
+          <w:p>
+            <w:r>
+              <w:t>owner_admin</w:t>
+            </w:r>
+          </w:p>
+        </w:tc>
+        <w:tc>
+          <w:tcPr>
+            <w:tcW w:type="dxa" w:w="1728"/>
+          </w:tcPr>
+          <w:p>
+            <w:r>
+              <w:t>Section 8.8 — lets a contractor submit their own fact to the KB; lands as status: ‘pending’, embedded via OpenAI, reviewed via approve-kb-entries.mjs/reject-kb-entries.mjs or the Platform Overview’s review-kb-submission (Section 13.4)</w:t>
+            </w:r>
+          </w:p>
+        </w:tc>
+      </w:tr>
+      <w:tr>
+        <w:tc>
+          <w:tcPr>
+            <w:tcW w:type="dxa" w:w="1727"/>
+          </w:tcPr>
+          <w:p>
+            <w:r>
+              <w:t>list-my-kb-submissions</w:t>
+            </w:r>
+          </w:p>
+        </w:tc>
+        <w:tc>
+          <w:tcPr>
+            <w:tcW w:type="dxa" w:w="1727"/>
+          </w:tcPr>
+          <w:p>
+            <w:r>
+              <w:t>fieldloop-list-my-kb-submissions</w:t>
+            </w:r>
+          </w:p>
+        </w:tc>
+        <w:tc>
+          <w:tcPr>
+            <w:tcW w:type="dxa" w:w="1946"/>
+          </w:tcPr>
+          <w:p>
+            <w:r>
+              <w:t>POST /kb/my-submissions</w:t>
+            </w:r>
+          </w:p>
+        </w:tc>
+        <w:tc>
+          <w:tcPr>
+            <w:tcW w:type="dxa" w:w="1728"/>
+          </w:tcPr>
+          <w:p>
+            <w:r>
+              <w:t>owner_admin</w:t>
+            </w:r>
+          </w:p>
+        </w:tc>
+        <w:tc>
+          <w:tcPr>
+            <w:tcW w:type="dxa" w:w="1728"/>
+          </w:tcPr>
+          <w:p>
+            <w:r>
+              <w:t>Section 8.8 — lets a contractor see the review status of facts they’ve submitted</w:t>
+            </w:r>
+          </w:p>
+        </w:tc>
+      </w:tr>
     </w:tbl>
     <w:p/>
     <w:p>
@@ -16189,6 +17594,72 @@
           <w:p>
             <w:r>
               <w:t>RETIRED — table dropped (migration 013). Replaced by kb_entries.status, same allowed values: pending, approved, rejected, superseded.</w:t>
+            </w:r>
+          </w:p>
+        </w:tc>
+      </w:tr>
+      <w:tr>
+        <w:tc>
+          <w:tcPr>
+            <w:tcW w:type="dxa" w:w="4320"/>
+          </w:tcPr>
+          <w:p>
+            <w:r>
+              <w:t>invoices.payment_method</w:t>
+            </w:r>
+          </w:p>
+        </w:tc>
+        <w:tc>
+          <w:tcPr>
+            <w:tcW w:type="dxa" w:w="4320"/>
+          </w:tcPr>
+          <w:p>
+            <w:r>
+              <w:t>stripe_cc, ach, check, cash (rejected: card, stripe, pending). invoices has no status column at all — status is derived from invoice_number/paid_ts (Section 8.6).</w:t>
+            </w:r>
+          </w:p>
+        </w:tc>
+      </w:tr>
+      <w:tr>
+        <w:tc>
+          <w:tcPr>
+            <w:tcW w:type="dxa" w:w="4320"/>
+          </w:tcPr>
+          <w:p>
+            <w:r>
+              <w:t>estimates_and_change_orders.doc_type</w:t>
+            </w:r>
+          </w:p>
+        </w:tc>
+        <w:tc>
+          <w:tcPr>
+            <w:tcW w:type="dxa" w:w="4320"/>
+          </w:tcPr>
+          <w:p>
+            <w:r>
+              <w:t>estimate, change_order (rejected: proposal, Estimate, invoice).</w:t>
+            </w:r>
+          </w:p>
+        </w:tc>
+      </w:tr>
+      <w:tr>
+        <w:tc>
+          <w:tcPr>
+            <w:tcW w:type="dxa" w:w="4320"/>
+          </w:tcPr>
+          <w:p>
+            <w:r>
+              <w:t>estimates_and_change_orders.status</w:t>
+            </w:r>
+          </w:p>
+        </w:tc>
+        <w:tc>
+          <w:tcPr>
+            <w:tcW w:type="dxa" w:w="4320"/>
+          </w:tcPr>
+          <w:p>
+            <w:r>
+              <w:t>draft, sent, signed, approved, rejected (rejected: submitted, awaiting_approval). Only ‘approved’/‘rejected’ are contractor-settable, and only from ‘signed’ (Section 8.6).</w:t>
             </w:r>
           </w:p>
         </w:tc>

</xml_diff>

<commit_message>
Add real Fleet & Customer database to Contractor Command Dashboard
Wires Sections 4 (Fleet & vehicles) and 5 (Customer database) to real
Lambdas + Supabase: list/add/update-vehicle (Retire = soft-delete via
is_active) and list/add/update-customer (phone-deduped, service_address
required per a live-caught NOT NULL gap). Fleet health is derived
honestly from real telemetry columns (No telemetry connected when
none are set, since no OBD-II integration exists yet) and reused to
fix Reports' now-dangling reference to the removed mock fleet array.
dashboardData.js's dead jobs/fleet/customers exports are removed.

Co-Authored-By: Claude Sonnet 5 <noreply@anthropic.com>
</commit_message>
<xml_diff>
--- a/FieldLoop_End_to_End_Implementation_Guide.docx
+++ b/FieldLoop_End_to_End_Implementation_Guide.docx
@@ -949,6 +949,9 @@
       <w:pPr/>
       <w:r>
         <w:t>Update (later session): job-address geocoding for geofencing (section 8.5) and an in-app setup-code alternative to the web link, with attempt-count lockout (section 10.7), were added after the above was written. add-technician/update-technician also now register a technician's email as a second Auth identity when on file (section 8.1).</w:t>
+      </w:r>
+      <w:r>
+        <w:t xml:space="preserve"> A further later session added Invoices &amp; Approvals, View Job File, and contractor-side Knowledge Base submission (sections 8.6-8.8, 11.4), a new admin-only cross-contractor Platform Overview (section 13), and real Fleet &amp; Customer management (section 8.9).</w:t>
       </w:r>
     </w:p>
     <w:p>
@@ -10245,6 +10248,172 @@
       <w:pPr/>
       <w:r>
         <w:t>backend/functions/submit-kb-entry/, list-my-kb-submissions/ (new Lambdas, deployed); backend/scripts/reject-kb-entries.mjs (new); src/command-dashboard/ContractorCommandDashboard.jsx (new Panel 11 via KnowledgeBaseSubmission component; dashboard.css's page-N/section-N rule extended to page-11/section-11); src/shared/services/api.js (submitKbEntry, listMyKbSubmissions added).</w:t>
+      </w:r>
+    </w:p>
+    <w:p>
+      <w:pPr>
+        <w:pStyle w:val="3"/>
+      </w:pPr>
+      <w:r>
+        <w:t>8.9 Fleet &amp; Customers — Real Data</w:t>
+      </w:r>
+    </w:p>
+    <w:p>
+      <w:pPr>
+        <w:pStyle w:val="4"/>
+      </w:pPr>
+      <w:r>
+        <w:t>Why</w:t>
+      </w:r>
+    </w:p>
+    <w:p>
+      <w:pPr/>
+      <w:r>
+        <w:t>The next chunk of remaining mock UI, picked deliberately as the lowest-risk one — same shape as the already-shipped Technician/Job Dispatch work (real tables + RLS already existed, nothing new to design). Sections 4 (“Fleet &amp; vehicles”) and 5 (“Customer database”) are now real.</w:t>
+      </w:r>
+    </w:p>
+    <w:p>
+      <w:pPr>
+        <w:pStyle w:val="4"/>
+      </w:pPr>
+      <w:r>
+        <w:t>Schema facts confirmed live before building (probe, not guess)</w:t>
+      </w:r>
+    </w:p>
+    <w:p>
+      <w:pPr>
+        <w:pStyle w:val="25"/>
+      </w:pPr>
+      <w:r>
+        <w:t>vehicles had 0 rows platform-wide at the time of this build (confirmed live) — nothing in this repository has ever written to it. Only contractor_id is NOT NULL; every other column (unit_number, make, model, year, vin_ref, default_driver_id, obd2_dongle_id, current_dtc_codes, oil_life_pct, next_service_mileage) is nullable, is_active defaults true. No CHECK constraint on any of them — confirmed via probe-insert, values are free text.</w:t>
+      </w:r>
+    </w:p>
+    <w:p>
+      <w:pPr>
+        <w:pStyle w:val="25"/>
+      </w:pPr>
+      <w:r>
+        <w:t>customers already had 54 real rows — this table is shared with create-job's inline new_customer path (section 8.2), so list-customers surfaces genuinely real, pre-existing data immediately, not an empty state.</w:t>
+      </w:r>
+    </w:p>
+    <w:p>
+      <w:pPr>
+        <w:pStyle w:val="25"/>
+      </w:pPr>
+      <w:r>
+        <w:t>customers.preferred_contact CHECK constraint: call, email, text only — voice, sms, phone all rejected. This differs from the original planning schema document's claimed voice/call/email, the same “docs vs. deployed reality” gap found repeatedly elsewhere in this project (section 5.2, section 8.6).</w:t>
+      </w:r>
+    </w:p>
+    <w:p>
+      <w:pPr>
+        <w:pStyle w:val="25"/>
+      </w:pPr>
+      <w:r>
+        <w:t>A real gap in the first pass's own verification, caught live, not by the probe suite: customers.service_address turned out to also be NOT NULL — the CHECK-constraint probes during schema verification always happened to include a service_address value (copying the pattern from other tables' probes), so this requirement was never actually isolated and confirmed until add-customer was deployed and a real, unscripted test insert without it failed. Fixed by adding an explicit validation check with a comment explaining exactly why it was missed, not just what the fix is.</w:t>
+      </w:r>
+    </w:p>
+    <w:p>
+      <w:pPr>
+        <w:pStyle w:val="4"/>
+      </w:pPr>
+      <w:r>
+        <w:t>What was built</w:t>
+      </w:r>
+    </w:p>
+    <w:p>
+      <w:pPr/>
+      <w:r>
+        <w:t>Six new Lambdas, all requireContractorRole(event, ['owner_admin']), the same pattern as add-technician/create-job: list-vehicles / add-vehicle / update-vehicle — update-vehicle also backs “Retire” (is_active: false, a soft-delete matching deactivate-technician's pattern rather than a hard DELETE, so fleet history isn't lost) — and list-customers (every customer for the contractor, including ones with zero jobs — the original mock data's own sample showed exactly that case) / add-customer (dedupes by normalized phone, reusing create-job's exact validatePhone/normalizeE164 functions verbatim since no shared helper exists for it yet) / update-customer.</w:t>
+      </w:r>
+    </w:p>
+    <w:p>
+      <w:pPr/>
+      <w:r>
+        <w:t>Frontend: the Fleet panel now derives a real “HEALTH” status per vehicle instead of showing a fabricated “Healthy” — current_dtc_codes/oil_life_pct/next_service_mileage are real columns but nothing populates them yet (no OBD-II integration exists anywhere in this repository), so a vehicle with none of them set honestly shows “No telemetry connected,” not a false-positive “Healthy.” This same vehicleHealth() helper (moved to module scope) was reused to fix the Reports component's “Fleet Health” sub-panel, which had a hard, now-broken reference to the just-removed mock fleet array — see the next subsection. New VehicleModal/CustomerModal components handle both Add and Edit in one component each (matching CreateJobModal's own dual-purpose shape rather than separate Add/Edit pairs, since the field sets barely differ). dashboardData.js's dead fleet/customers/jobs exports were deleted outright once confirmed unused (grepped for every import site first) rather than left as drift-inviting dead code.</w:t>
+      </w:r>
+    </w:p>
+    <w:p>
+      <w:pPr>
+        <w:pStyle w:val="4"/>
+      </w:pPr>
+      <w:r>
+        <w:t>A real bug caught before it shipped: Reports's hard dependency on the mock fleet array</w:t>
+      </w:r>
+    </w:p>
+    <w:p>
+      <w:pPr/>
+      <w:r>
+        <w:t>Removing the fleet import (no longer needed once the Fleet panel went real) would have silently broken the Reports section's “Fleet Health — OBD-II Monitoring” sub-panel, which read fleet.map(...) directly — caught by grepping for every remaining reference to fleet before considering the removal done, not by the build (a bare identifier reference like this is a runtime ReferenceError, not always a build-time catch depending on bundler settings). Fixed by passing real vehicle data into the Reports component and reusing the same vehicleHealth() derivation — Reports stays otherwise mock (out of scope for this pass) but no longer has a phantom dependency on data that doesn't exist anymore.</w:t>
+      </w:r>
+    </w:p>
+    <w:p>
+      <w:pPr>
+        <w:pStyle w:val="4"/>
+      </w:pPr>
+      <w:r>
+        <w:t>What was tested (real, live — not just code review)</w:t>
+      </w:r>
+    </w:p>
+    <w:p>
+      <w:pPr>
+        <w:pStyle w:val="25"/>
+      </w:pPr>
+      <w:r>
+        <w:t>Full vehicle lifecycle scripted directly against the API: create → verify real row → “Retire” (is_active: false) → verify in list-vehicles. Full customer lifecycle: create (with a guard test confirming a duplicate phone number is correctly rejected) → update → verify in list-customers → delete.</w:t>
+      </w:r>
+    </w:p>
+    <w:p>
+      <w:pPr>
+        <w:pStyle w:val="25"/>
+      </w:pPr>
+      <w:r>
+        <w:t>A real gap in the Lambda found this way, not by code review: the first add-customer test omitted service_address and got a raw Postgres constraint error back — fixed, redeployed, and re-verified with a proper guard test (missing address → clean 400, not a raw database error) before moving on.</w:t>
+      </w:r>
+    </w:p>
+    <w:p>
+      <w:pPr>
+        <w:pStyle w:val="25"/>
+      </w:pPr>
+      <w:r>
+        <w:t>Real browser (Playwright), full flow: Add vehicle → Edit → Retire, Add customer → Edit, all via the actual modals, all producing the real toast confirmations.</w:t>
+      </w:r>
+    </w:p>
+    <w:p>
+      <w:pPr>
+        <w:pStyle w:val="25"/>
+      </w:pPr>
+      <w:r>
+        <w:t>A real, reproducible timing issue found during this exact browser pass: navigating straight to the Fleet panel without visiting Technicians/Dispatch first left the technician list on its mock fallback (which has no id field) at the moment the vehicle modal's driver dropdown rendered — a real React “missing key” warning, and a real risk of submitting a bogus driver id. Fixed by also loading the real technician list when the Fleet panel becomes active, not just Dispatch/Technicians.</w:t>
+      </w:r>
+    </w:p>
+    <w:p>
+      <w:pPr>
+        <w:pStyle w:val="25"/>
+      </w:pPr>
+      <w:r>
+        <w:t>A second real, reproducible issue, this time in the test script's own resilience, not the app: a vehicle-creation write action failed with a transient 503 during the same burst of concurrent Lambda cold starts already documented elsewhere in this project as usually-benign for passive read calls — but a one-shot write action has no automatic retry the way React's double-invoke gives reads. Confirmed this was purely transient (the identical action retried a few seconds later succeeded immediately, and the underlying Lambda logic was already independently proven correct via the direct API-level script) rather than assumed — the verification script now retries a failed submit once, the same way a real user would just click the button again.</w:t>
+      </w:r>
+    </w:p>
+    <w:p>
+      <w:pPr>
+        <w:pStyle w:val="25"/>
+      </w:pPr>
+      <w:r>
+        <w:t>All test/seed data (vehicles, probe customers) deleted after verification, including leftover rows from the diagnostic pass that first surfaced the 503 (found via a direct query, not assumed cleaned).</w:t>
+      </w:r>
+    </w:p>
+    <w:p>
+      <w:pPr>
+        <w:pStyle w:val="4"/>
+      </w:pPr>
+      <w:r>
+        <w:t>Files</w:t>
+      </w:r>
+    </w:p>
+    <w:p>
+      <w:pPr/>
+      <w:r>
+        <w:t>backend/functions/list-vehicles/, add-vehicle/, update-vehicle/, list-customers/, add-customer/, update-customer/ (new Lambdas, deployed); backend/functions/package-lambda.ps1 (ValidateSet updated); src/command-dashboard/ContractorCommandDashboard.jsx (Fleet/Customers panels rewritten to real data with VehicleModal/CustomerModal; vehicleHealth() added at module scope and reused by Reports; loadVehicles/loadCustomers added, loadTechs also now fires for the Fleet panel); src/command-dashboard/dashboardData.js (rewritten — dead jobs/fleet/customers exports removed, only the still-used technicians fallback kept); src/shared/services/api.js (listVehicles, addVehicle, updateVehicle, listCustomers, addCustomer, updateCustomer added).</w:t>
       </w:r>
     </w:p>
     <w:p>

</xml_diff>

<commit_message>
Add Team & Access, Data Export requests, and Retention Queue backend + dashboard wiring
New Lambdas (list-team, list-audit-log, create-export-request, list-export-requests,
list-retention-queue, update-retention-flag, list-live-feed) back Sections 9/10/6 of the
Contractor Command Dashboard with real data instead of mocks. Also fixes audit-log action
values in get-contractor/create-contractor-portal-user and packages the new functions into
package-lambda.ps1.

Co-Authored-By: Claude Sonnet 5 <noreply@anthropic.com>
</commit_message>
<xml_diff>
--- a/FieldLoop_End_to_End_Implementation_Guide.docx
+++ b/FieldLoop_End_to_End_Implementation_Guide.docx
@@ -267,7 +267,7 @@
         <w:t xml:space="preserve">Contractor Command Dashboard </w:t>
       </w:r>
       <w:r>
-        <w:t>(/, /dashboard) — the contractor-facing web product. Login/identity, technician roster management, job dispatch, and voice-to-job-schedule are real and live-verified; invoicing/fleet/reports/etc. are still intentionally mock data, a deliberate scope boundary being closed feature by feature.</w:t>
+        <w:t>(/, /dashboard) — the contractor-facing web product. Login/identity, technician roster management, job dispatch, voice-to-job-schedule, invoices &amp; approvals (view/approve only), fleet, customers, reports &amp; analytics, retention queue, data archive &amp; export, and team &amp; access are all real and live-verified (Section 8). Two pieces remain deliberate, flagged future work rather than built: a full multi-role Team &amp; Access system, and the actual data-export file-generation/delivery pipeline (Section 8.10).</w:t>
       </w:r>
     </w:p>
     <w:p>
@@ -963,6 +963,12 @@
       <w:pPr/>
       <w:r>
         <w:t>Update (later session): Invoices &amp; Approvals (Section 8.6), View Job File (Section 8.7), and contractor-side Knowledge Base submission (Section 8.8, Section 11.4) were added to the Contractor Command Dashboard. Invoices &amp; Approvals went through a real correction mid-build — an initial version let the contractor create/edit estimates and invoices directly, which turned out to contradict the documented workflow (the technician creates and sends these from the mobile app; the contractor only approves or rejects a customer-signed one); the wrong Lambdas were torn down, not just unwired, and the surviving endpoint was narrowed accordingly — see Section 8.6 for the full story. A new admin-only, cross-contractor Platform Overview (Section 13) was also built, covering every contractor's status/usage/revenue, compliance expirations, and a real KB submission review queue, then reworked from a single static page into a real tabbed dashboard with a per-contractor drill-down page after a dedicated design pass.</w:t>
+      </w:r>
+    </w:p>
+    <w:p>
+      <w:pPr/>
+      <w:r>
+        <w:t>Update (later session): the last chunk of Contractor Command Dashboard panels flagged as mock above — Reports &amp; Analytics (including its Retention Queue sub-panel), Data Archive &amp; Export, and Team &amp; Access — were made real (Section 8.10), closing the scope boundary described in the bullet list above. Technician efficiency was redefined from a fabricated “billed vs. GPS-clocked %” (no clock-out event exists anywhere in the schema to compute that honestly) to a real “jobs completed &amp; billed per technician” metric; Labor Bleed was dropped outright rather than shown as an empty state, since no delay-reason data exists anywhere to be honest about. Two pieces remain deliberately unbuilt and are flagged as future work rather than silently dropped: the full multi-role Team &amp; Access system, and the real data-export file-generation/delivery pipeline. Per the project owner, enabling Supabase’s Phone auth provider is intentionally deferred to product launch, not before — technician sign-in testing should keep using the email + password path (already real, Section 8.1), not phone.</w:t>
       </w:r>
     </w:p>
     <w:p>
@@ -10083,7 +10089,7 @@
     <w:p>
       <w:pPr/>
       <w:r>
-        <w:t>The dispatch board's “View job file” button (on every job card) had no onClick handler at all — a dead button, clicking it did nothing. Separately, Panel 6 (“Live field data stream”) already existed but was permanently hardcoded to a fictional job FL-2847 with fabricated GPS/photo/barcode/SMS/e-signature events, regardless of which job was actually being viewed.</w:t>
+        <w:t>The dispatch board’s “View job file” button (on every job card) had no onClick handler at all — a dead button, clicking it did nothing. Separately, Panel 6 (“Live field data stream”) already existed but was, at the time, permanently hardcoded to a fictional job FL-2847 with fabricated GPS/photo/barcode/SMS/e-signature events, regardless of which job was actually being viewed. Panel 6 itself was made real later, Section 8.11.</w:t>
       </w:r>
     </w:p>
     <w:p>
@@ -10414,6 +10420,496 @@
       <w:pPr/>
       <w:r>
         <w:t>backend/functions/list-vehicles/, add-vehicle/, update-vehicle/, list-customers/, add-customer/, update-customer/ (new Lambdas, deployed); backend/functions/package-lambda.ps1 (ValidateSet updated); src/command-dashboard/ContractorCommandDashboard.jsx (Fleet/Customers panels rewritten to real data with VehicleModal/CustomerModal; vehicleHealth() added at module scope and reused by Reports; loadVehicles/loadCustomers added, loadTechs also now fires for the Fleet panel); src/command-dashboard/dashboardData.js (rewritten — dead jobs/fleet/customers exports removed, only the still-used technicians fallback kept); src/shared/services/api.js (listVehicles, addVehicle, updateVehicle, listCustomers, addCustomer, updateCustomer added).</w:t>
+      </w:r>
+    </w:p>
+    <w:p>
+      <w:pPr>
+        <w:pStyle w:val="3"/>
+      </w:pPr>
+      <w:r>
+        <w:t>8.10 Reports &amp; Analytics, Retention Queue, Data Archive &amp; Export, Team &amp; Access — Real Data</w:t>
+      </w:r>
+    </w:p>
+    <w:p>
+      <w:pPr>
+        <w:pStyle w:val="4"/>
+      </w:pPr>
+      <w:r>
+        <w:t>Why</w:t>
+      </w:r>
+    </w:p>
+    <w:p>
+      <w:pPr/>
+      <w:r>
+        <w:t>The last chunk of Contractor Command Dashboard panels flagged as mock (Section 1.3, Section 8.9’s own scope note): the Reports &amp; Analytics panel (including its Retention Queue sub-panel), Data Archive &amp; Export, and Team &amp; Access. Scoped with the project owner across two rounds of clarifying questions before building, since two of the three touched real definitional gaps in the schema, not just “swap mock for a real query” — the same category of risk that caused the Invoices/Approvals correction in Section 8.6.</w:t>
+      </w:r>
+    </w:p>
+    <w:p>
+      <w:pPr>
+        <w:pStyle w:val="4"/>
+      </w:pPr>
+      <w:r>
+        <w:t>Schema facts confirmed live before building (probe, not guess)</w:t>
+      </w:r>
+    </w:p>
+    <w:p>
+      <w:pPr>
+        <w:pStyle w:val="25"/>
+      </w:pPr>
+      <w:r>
+        <w:t>jobs.scheduled_end is null on every real job platform-wide, and total_invoiced/total_paid are 0 on every real job (confirmed live) — there is no clock-out event anywhere in the schema and no real billed-dollar data yet. This means the old mock’s “Technician efficiency (billed vs. GPS-clocked %)” metric had no real signal to compute at all, not just “not much data yet.” Confirmed with the project owner, who chose to redefine the panel to a metric that is actually real: “Jobs completed &amp; billed per technician” (real job counts plus real total_invoiced sums, honestly $0/0 jobs today for every technician, since nothing has been marked complete-and-billed yet).</w:t>
+      </w:r>
+    </w:p>
+    <w:p>
+      <w:pPr>
+        <w:pStyle w:val="25"/>
+      </w:pPr>
+      <w:r>
+        <w:t>Labor Bleed (the mock’s “Unapplied Time” sub-panel) has zero underlying data of any kind — no delay-reason tracking (waiting on parts, customer approval, rework, weather) exists anywhere in the schema, unlike Fleet Health’s real-but-unpopulated columns (Section 8.9). Confirmed with the project owner: dropped entirely rather than built as an empty state, since there is nothing real to be honest about.</w:t>
+      </w:r>
+    </w:p>
+    <w:p>
+      <w:pPr>
+        <w:pStyle w:val="25"/>
+      </w:pPr>
+      <w:r>
+        <w:t>jobs has no completed_at column. The new retention-queue Lambda uses jobs.updated_at on a customer’s most recently touched complete/closed/invoiced/paid job as the best real proxy for “when this job finished” — a documented approximation, not a guess dressed up as fact.</w:t>
+      </w:r>
+    </w:p>
+    <w:p>
+      <w:pPr>
+        <w:pStyle w:val="25"/>
+      </w:pPr>
+      <w:r>
+        <w:t>customers.retention_flags (jsonb) only has three documented checkpoint slots (day1_sent/month3_sent/month12_sent) — the mobile-app job spine’s own four-checkpoint description (Section 6.4: 24hr/48hr/3mo/12mo) has no 48-hour slot in the real schema. Not invented here; the real three-checkpoint schema was used as-is, and this gap is flagged rather than silently reconciled.</w:t>
+      </w:r>
+    </w:p>
+    <w:p>
+      <w:pPr>
+        <w:pStyle w:val="25"/>
+      </w:pPr>
+      <w:r>
+        <w:t>contractor_users.role only ever contains owner_admin (five real rows, confirmed live) — an earlier migration (Section 8.1) deliberately narrowed this CHECK constraint after the original mock Team &amp; Access UI’s dispatcher/bookkeeper/field_lead roles turned out to be guessed against the planning schema document, never verified against what was actually deployed. There is no multi-role team login system to wire up today.</w:t>
+      </w:r>
+    </w:p>
+    <w:p>
+      <w:pPr>
+        <w:pStyle w:val="25"/>
+      </w:pPr>
+      <w:r>
+        <w:t>access_audit_log.user_id references fl_users (staff), not contractor_users — this table records FieldLoop staff actions against a contractor’s account (onboarding saves, admin actions, PDF exports), not the contractor’s own team activity. Confirmed live: every real row for a test contractor was either a staff action, resolved to a real fl_users email, or a null-actor row from an unauthenticated flow, labeled “Automated process.” Built and labeled honestly as “recent account activity,” not “team activity.”</w:t>
+      </w:r>
+    </w:p>
+    <w:p>
+      <w:pPr>
+        <w:pStyle w:val="25"/>
+      </w:pPr>
+      <w:r>
+        <w:t>data_export_requests’s real CHECK constraints match the original planning schema document exactly (export_type: full/jobs/invoices/single_job/media_only; output_format: zip/csv/pdf; status: queued/processing/ready/expired/failed) — verified live via probe-insert/delete, a rare case in this project where the document and the deployed reality already agreed.</w:t>
+      </w:r>
+    </w:p>
+    <w:p>
+      <w:pPr>
+        <w:pStyle w:val="4"/>
+      </w:pPr>
+      <w:r>
+        <w:t>Decisions made with the project owner before building</w:t>
+      </w:r>
+    </w:p>
+    <w:p>
+      <w:pPr>
+        <w:pStyle w:val="25"/>
+      </w:pPr>
+      <w:r>
+        <w:t>Team &amp; Access: build the minimal real version now (a real contractor_users roster plus a real account-activity log), explicitly not the full spec’s multi-role invite system with dashboard-wide permission gating — flagged as real future work below, not built this pass.</w:t>
+      </w:r>
+    </w:p>
+    <w:p>
+      <w:pPr>
+        <w:pStyle w:val="25"/>
+      </w:pPr>
+      <w:r>
+        <w:t>Reports &amp; Analytics / Retention queue: wire both to real data anyway, even knowing most values would be honest zeros today — matches the Fleet Health precedent (Section 8.9) of showing an honest empty/zero state rather than fabricating one.</w:t>
+      </w:r>
+    </w:p>
+    <w:p>
+      <w:pPr>
+        <w:pStyle w:val="25"/>
+      </w:pPr>
+      <w:r>
+        <w:t>Labor Bleed: dropped, not kept as an empty state — there is no real column to point an honest empty state at.</w:t>
+      </w:r>
+    </w:p>
+    <w:p>
+      <w:pPr>
+        <w:pStyle w:val="25"/>
+      </w:pPr>
+      <w:r>
+        <w:t>Data Archive &amp; Export: build real request-tracking only (a real data_export_requests row per request, with a real status shown), not the actual file-generation/S3-signed-URL delivery pipeline, which is flagged as real future work below.</w:t>
+      </w:r>
+    </w:p>
+    <w:p>
+      <w:pPr>
+        <w:pStyle w:val="4"/>
+      </w:pPr>
+      <w:r>
+        <w:t>What was built</w:t>
+      </w:r>
+    </w:p>
+    <w:p>
+      <w:pPr/>
+      <w:r>
+        <w:t>Six new Lambdas, all requireContractorRole(event, ['owner_admin']), the same pattern as every Contractor Command Dashboard Lambda since Section 8.1: list-team / list-audit-log (real Team &amp; Access data — the roster and, on demand, a toggleable real activity log); list-retention-queue / update-retention-flag (computes, per customer, the next due retention checkpoint from real jobs/customers data, and the queue’s only write action, a Pause/Resume toggle on customers.retention_flags.paused — nothing ever marks a checkpoint sent, since no automated dispatch exists; Beat 8 of the job spine is “backend, no human touch,” a future scheduler wired to the messaging adapter, not built here); list-export-requests / create-export-request (real data_export_requests rows, left at status ‘queued’, no file generation).</w:t>
+      </w:r>
+    </w:p>
+    <w:p>
+      <w:pPr/>
+      <w:r>
+        <w:t>Frontend (ContractorCommandDashboard.jsx): the Reports &amp; Analytics panel now renders a real TechnicianJobReport (the redefined metric above) alongside the existing, unchanged FleetHealthReport, plus a real RetentionQueue with a working Pause/Resume. The Data Archive &amp; Export panel’s form now posts real export_type/output_format/include_categories and its history table reads real data_export_requests rows — the old client-side fake queued-to-ready simulation was removed outright, not left dormant. Team &amp; Access shows the real (currently single-row) team roster plus a toggleable real audit-log view, with an honest banner explaining the one-role-today limitation instead of a fabricated multi-role permissions matrix. A stray hardcoded “TECHS ON CLOCK: 6 of 9” KPI, with no real data behind it — the same no-clock-event gap as above — was also replaced with a real “ACTIVE TECHNICIANS” count while this file was open.</w:t>
+      </w:r>
+    </w:p>
+    <w:p>
+      <w:pPr>
+        <w:pStyle w:val="4"/>
+      </w:pPr>
+      <w:r>
+        <w:t>Problem encountered: a double-slash typo silently 500’d all six new routes</w:t>
+      </w:r>
+    </w:p>
+    <w:p>
+      <w:pPr/>
+      <w:r>
+        <w:t>Every one of the six new routes initially returned a bare 500 Internal Server Error through API Gateway even though a direct aws lambda invoke against the same functions worked fine — traced to a double-slash typo in the aws lambda add-permission --source-arn pattern used to grant API Gateway invoke rights (an extra leading slash produced .../*/*//team/list instead of .../*/*/team/list), which made the IAM ArnLike condition never match the real API Gateway invocation ARN. Fixed by reissuing all six permissions with the same broad .../*/*/* wildcard the existing, working Lambdas already use. A reminder that add-permission’s --source-arn is exactly the kind of string-built ARN this project’s own conventions already warn about getting subtly wrong — verify the actual resource policy (aws lambda get-policy) against a known-working one when a brand-new route 500s for no apparent reason in the Lambda’s own logs.</w:t>
+      </w:r>
+    </w:p>
+    <w:p>
+      <w:pPr>
+        <w:pStyle w:val="4"/>
+      </w:pPr>
+      <w:r>
+        <w:t>Explicitly flagged as future work, not built this pass</w:t>
+      </w:r>
+    </w:p>
+    <w:p>
+      <w:pPr>
+        <w:pStyle w:val="25"/>
+      </w:pPr>
+      <w:r>
+        <w:t xml:space="preserve">Full Team &amp; Access per the original spec: </w:t>
+      </w:r>
+      <w:r>
+        <w:rPr>
+          <w:b w:val="0"/>
+        </w:rPr>
+        <w:t>security-sensitive, deserves its own scoping/plan-mode pass. Reconnaissance already done (2026-08-19) — see Section 8.10a1 below — so a future pass doesn’t have to redo it; building was explicitly deferred by the project owner before any code was written (“not important for the prototype right now”).</w:t>
+      </w:r>
+    </w:p>
+    <w:p>
+      <w:pPr>
+        <w:pStyle w:val="25"/>
+      </w:pPr>
+      <w:r>
+        <w:t>Full Data Archive &amp; Export pipeline: actual ZIP/CSV/PDF generation, S3 signed-URL delivery (72-hour expiry per the schema’s own expires_at column), and watermarking. An async worker of some kind (this repository has none today — every Lambda here is synchronous request/response) would need designing first.</w:t>
+      </w:r>
+    </w:p>
+    <w:p>
+      <w:pPr>
+        <w:pStyle w:val="25"/>
+      </w:pPr>
+      <w:r>
+        <w:t>Labor Bleed / delay-reason tracking: would need the mobile app to start capturing categorized downtime (waiting on parts, customer approval delays, rework, weather) before this panel could ever be honestly real — not something the web dashboard can originate on its own.</w:t>
+      </w:r>
+    </w:p>
+    <w:p>
+      <w:pPr>
+        <w:pStyle w:val="25"/>
+      </w:pPr>
+      <w:r>
+        <w:t>Retention queue’s 48-hour checkpoint: the job spine (Section 6.4) describes 24hr/48hr/3mo/12mo; the real schema’s retention_flags only has three slots. Would need a migration if the 48-hour checkpoint is actually wanted, not assumed away.</w:t>
+      </w:r>
+    </w:p>
+    <w:p>
+      <w:pPr>
+        <w:pStyle w:val="25"/>
+      </w:pPr>
+      <w:r>
+        <w:t>Retention queue’s actual sending: this pass only computes and displays what’s due — a real scheduler wired to the messaging adapter to actually notify customers and mark the *_sent flags is future work, consistent with Beat 8’s “backend, no human touch” description.</w:t>
+      </w:r>
+    </w:p>
+    <w:p>
+      <w:pPr>
+        <w:pStyle w:val="4"/>
+      </w:pPr>
+      <w:r>
+        <w:t>What was tested (real, live — not just code review)</w:t>
+      </w:r>
+    </w:p>
+    <w:p>
+      <w:pPr>
+        <w:pStyle w:val="25"/>
+      </w:pPr>
+      <w:r>
+        <w:t>All six endpoints called live via a disposable Node script signed in as a real test contractor: confirmed real team/audit-log/export-request data end-to-end, including a cross-tenant IDOR check on retention/update (a fake customer_id correctly rejected, “Customer not found for your company.”).</w:t>
+      </w:r>
+    </w:p>
+    <w:p>
+      <w:pPr>
+        <w:pStyle w:val="25"/>
+      </w:pPr>
+      <w:r>
+        <w:t>Retention queue logic specifically verified against real fixture data, since the live test contractor had zero completed jobs to exercise the real branch otherwise: created three disposable customers/jobs directly via the service-role key — one five days past completion with no flags sent (correctly surfaced as day1_sent due), one 100 days past completion with day1_sent already true (correctly surfaced as month3_sent due, correctly sorted ahead of the day1 row by due date), one with every flag already sent (correctly absent from the queue). Pause/Resume round-tripped correctly against the real fixture. All fixtures deleted after.</w:t>
+      </w:r>
+    </w:p>
+    <w:p>
+      <w:pPr>
+        <w:pStyle w:val="25"/>
+      </w:pPr>
+      <w:r>
+        <w:t>Real browser (Playwright), signed in as the same test contractor: drove all three panels, submitted a real export request and confirmed the toast plus the real row appearing in the history table, toggled the audit log open and confirmed real entries render, screenshotted all three panels clean with zero unexpected console errors (only the known transient 503s from several brand-new Lambdas cold-starting under concurrent load in the same test run, the same benign class already documented in Section 8.9 — not reproducible once the Lambdas are warm).</w:t>
+      </w:r>
+    </w:p>
+    <w:p>
+      <w:pPr>
+        <w:pStyle w:val="25"/>
+      </w:pPr>
+      <w:r>
+        <w:t>npm run lint and npm run build both clean before any of the above. All test/seed data deleted after verification.</w:t>
+      </w:r>
+    </w:p>
+    <w:p>
+      <w:pPr>
+        <w:pStyle w:val="4"/>
+      </w:pPr>
+      <w:r>
+        <w:t>Files</w:t>
+      </w:r>
+    </w:p>
+    <w:p>
+      <w:pPr/>
+      <w:r>
+        <w:t>backend/functions/list-team/, list-audit-log/, list-retention-queue/, update-retention-flag/, list-export-requests/, create-export-request/ (new Lambdas, deployed); backend/functions/package-lambda.ps1 (ValidateSet updated); src/command-dashboard/ContractorCommandDashboard.jsx (Reports &amp; Analytics, Data Archive &amp; Export, and Team &amp; Access panels rewritten; TechnicianJobReport/FleetHealthReport/RetentionQueue added, replacing the old Reports/Retention/Team/Permissions mock components; new state and loaders for report jobs, retention queue, team roster, audit log, and export requests; the “TECHS ON CLOCK” KPI replaced); src/shared/services/api.js (listTeam, listAuditLog, listRetentionQueue, updateRetentionFlag, listExportRequests, createExportRequest added).</w:t>
+      </w:r>
+    </w:p>
+    <w:p>
+      <w:pPr>
+        <w:pStyle w:val="3"/>
+      </w:pPr>
+      <w:r>
+        <w:t>8.10a Fixed: Two Silently-Failing access_audit_log Inserts</w:t>
+      </w:r>
+    </w:p>
+    <w:p>
+      <w:pPr/>
+      <w:r>
+        <w:t>Flagged as a known gap in Section 8.2 (found while building Job Dispatch, never fixed) and re-surfaced while building 8.10’s real audit-log viewer: get-contractor inserted action: ‘VIEWED’ and create-contractor-portal-user inserted action: ‘create’ — neither value passes access_audit_log.action’s real CHECK constraint (update/view/reveal/delete/export only), and neither call checked the insert’s error, so every invocation of either Lambda silently failed to write its audit row. Fixed: ‘VIEWED’ → ‘view’, ‘create’ → ‘update’ (matching the convention already used for every other creation-type audit action in this codebase), and both inserts now log their error instead of ignoring it — a failed audit write should never block the actual operation, so this logs loudly rather than throwing. Verified live: get-contractor called against a real contractor produced a real new ‘view’ row; create-contractor-portal-user, tested against a disposable throwaway contractor (deleted after), produced a real new ‘update’ row. Grepped every other access_audit_log insert in the codebase for the same mistake — no other instance found.</w:t>
+      </w:r>
+    </w:p>
+    <w:p>
+      <w:pPr>
+        <w:pStyle w:val="3"/>
+      </w:pPr>
+      <w:r>
+        <w:t>8.10a1 Full Team &amp; Access RBAC — Reconnaissance Done, Build Explicitly Deferred</w:t>
+      </w:r>
+    </w:p>
+    <w:p>
+      <w:pPr/>
+      <w:r>
+        <w:t>Asked to start this next. Before writing any code, two real decisions needed the project owner’s input first (role set, invite mechanism — the same “verify before guessing” discipline that already corrected this exact table once, Section 8.1). A full frontend reconnaissance pass was run first so the questions could be concrete, not abstract — then the project owner decided the feature isn’t important for the prototype right now and to stop, flagging it here instead. Nothing below has been built; it is preserved so a future pass doesn’t have to redo this exploration.</w:t>
+      </w:r>
+    </w:p>
+    <w:p>
+      <w:pPr/>
+      <w:r>
+        <w:t>The original spec’s intended shape (Section 13 of the Contractor Command Dashboard spec document) is three extra roles beyond owner_admin — dispatcher, bookkeeper, field_lead — each with a seven-capability permission matrix (Jobs &amp; Dispatch, Estimates &amp; Approvals, Invoices &amp; Payments, Customer PII, Team &amp; Access, Data Archive, Company Settings). The spec’s matrix includes capabilities that don’t correspond to any real action in this app today — for example “Send only” for estimates, when nothing in this codebase ever sends an estimate (that’s mobile-side, Section 8.6’s correction). Any future build should reconcile the matrix against real actions, not implement it literally.</w:t>
+      </w:r>
+    </w:p>
+    <w:p>
+      <w:pPr/>
+      <w:r>
+        <w:t>Current gating is minimal: only two booleans exist in the whole dashboard, both tenant.role === ‘owner_admin’, each gating only the open-modal trigger button, never the mutation function itself. Five real write actions are completely ungated today — harmless only because a second role doesn’t exist yet: reassigning a technician on a dispatch job, approving or rejecting an estimate, submitting a Knowledge Base entry, requesting a data export, and the retention queue’s Pause/Resume. Read-sensitive data — customer PII, financial figures, the audit log, the team roster itself — all render unconditionally today as well, and would need per-role masking in a real build. The tenant object the dashboard receives only carries name/user/email/role, with no contractor_user_id or permissions object, and no permission abstraction (a usePermissions() hook or similar) exists anywhere in this app — building this for real means new infrastructure, not a refactor of something that half-exists.</w:t>
+      </w:r>
+    </w:p>
+    <w:p>
+      <w:pPr/>
+      <w:r>
+        <w:t>Two real decisions still need the project owner’s input before building, whenever this is picked back up: (1) adopt the spec’s three roles as-is, or a different/custom set; (2) the invite mechanism — a one-time setup link, reusing the technician setup-link pattern from Section 10.2/10.7 with no raw password ever shown or transmitted, versus an admin-set password shown once, simpler to build but reintroducing the exact pattern that setup-link approach deliberately moved away from. Also unresolved and lower-stakes: soft-delete (an is_active flag plus an Auth ban, matching the technician deactivation pattern in Section 8.1.2) versus a hard delete for “Remove team member” — contractor_users has no is_active column today, unlike technicians.</w:t>
+      </w:r>
+    </w:p>
+    <w:p>
+      <w:pPr>
+        <w:pStyle w:val="3"/>
+      </w:pPr>
+      <w:r>
+        <w:t>8.11 Live Feed Panel (Panel 6) — Real Data, Grouped Per Active Job</w:t>
+      </w:r>
+    </w:p>
+    <w:p>
+      <w:pPr>
+        <w:pStyle w:val="4"/>
+      </w:pPr>
+      <w:r>
+        <w:t>Why</w:t>
+      </w:r>
+    </w:p>
+    <w:p>
+      <w:pPr/>
+      <w:r>
+        <w:t>Panel 6, “Live field data stream,” was the last fully-mock panel in the Contractor Command Dashboard — a hardcoded fictional job (“FL-2847, Master Bath Remodel”) with six hand-written event rows, left mock during Section 8.7 while a separate, real per-job viewer (JobFileModal plus get-job-file) was built instead for one-job-at-a-time viewing. This pass rebuilds it for real: a dispatcher-facing view of every job actively being worked right now, grouped per job rather than one flat chronological stream, so a dispatcher can scan “what’s happening on job X” at a glance.</w:t>
+      </w:r>
+    </w:p>
+    <w:p>
+      <w:pPr/>
+      <w:r>
+        <w:t>Planned in full with the project owner first (plan mode, no code written until the plan was reviewed and approved) — covering a data audit, grouping/structure design, real-time behavior, UI/UX approach, and technical scope.</w:t>
+      </w:r>
+    </w:p>
+    <w:p>
+      <w:pPr>
+        <w:pStyle w:val="4"/>
+      </w:pPr>
+      <w:r>
+        <w:t>Schema/data facts confirmed live before building (probe, not guess)</w:t>
+      </w:r>
+    </w:p>
+    <w:p>
+      <w:pPr>
+        <w:pStyle w:val="25"/>
+      </w:pPr>
+      <w:r>
+        <w:t>field_events is real and flowing: 60 rows platform-wide at planning time, spanning 20 distinct jobs, every job_id verified to resolve to a real job belonging to the right contractor (zero orphans). Most recent event was from the same day as planning — genuinely live, not stale fixture data.</w:t>
+      </w:r>
+    </w:p>
+    <w:p>
+      <w:pPr>
+        <w:pStyle w:val="25"/>
+      </w:pPr>
+      <w:r>
+        <w:t>Only 2 of the 8 documented event_type values are actually populated: photo and gps_arrive. The other 6 (gps_depart/manual_arrive/voice_note/status_change/job_timer_start/job_timer_stop) are the mobile team’s own documented-but-unobserved vocabulary, already captured in FIELD_EVENT_LABELS (built for JobFileModal) — reused as-is, rendering all 8 honestly rather than just the 2 seen so far.</w:t>
+      </w:r>
+    </w:p>
+    <w:p>
+      <w:pPr>
+        <w:pStyle w:val="25"/>
+      </w:pPr>
+      <w:r>
+        <w:t>“Estimate activity,” raised as a desired example in the request, has zero real data to show — estimates_and_change_orders has 0 rows platform-wide (confirmed live), and it’s a status-field table, not an append-only event log like field_events, so merging it in would mean a second query shape for a data source that’s currently empty everywhere. Cut from this pass, flagged as a real future enhancement once the mobile app starts writing real estimates.</w:t>
+      </w:r>
+    </w:p>
+    <w:p>
+      <w:pPr>
+        <w:pStyle w:val="25"/>
+      </w:pPr>
+      <w:r>
+        <w:t>A genuinely new fact, worth recording: verified live that field_events and jobs both have working RLS that correctly scopes to the signed-in contractor — tested with a real contractor session via the anon key (not the service-role key), confirmed zero cross-tenant rows visible either way. This had never been exercised or confirmed anywhere in this project before. Recorded for whoever eventually considers a Supabase Realtime subscription here or elsewhere — the RLS foundation for it is real and already correct, even though this pass didn’t use it.</w:t>
+      </w:r>
+    </w:p>
+    <w:p>
+      <w:pPr>
+        <w:pStyle w:val="4"/>
+      </w:pPr>
+      <w:r>
+        <w:t>Grouping/structure design</w:t>
+      </w:r>
+    </w:p>
+    <w:p>
+      <w:pPr/>
+      <w:r>
+        <w:t>“Active” means status en_route or on_site — the two statuses that mean a technician is at or heading to the job right now. Deliberately narrower than “any job with events” (the real data shows that includes scheduled/complete/paid/invoiced jobs too) — a completed job already has a real historical view (the existing “View job file” action, unchanged), so this panel doesn’t duplicate that as a “history” mode. A job simply drops off the live view on the next poll once its status moves past on_site. Every qualifying job is shown even with zero events yet — an honest “No events logged yet” state rather than hiding a job the dispatcher already knows is active. One card per job, jobs sorted by their own most-recent-event timestamp (freshest first; a job with no events sorts last); within a job, events ordered most-recent-first.</w:t>
+      </w:r>
+    </w:p>
+    <w:p>
+      <w:pPr>
+        <w:pStyle w:val="4"/>
+      </w:pPr>
+      <w:r>
+        <w:t>Real-time behavior</w:t>
+      </w:r>
+    </w:p>
+    <w:p>
+      <w:pPr/>
+      <w:r>
+        <w:t>Confirmed via a full grep of the frontend that no live/real-time precedent existed anywhere in this app before this pass — no postgres_changes/channel()/WebSocket-to-Supabase usage anywhere; the only interval in the app was a plain UI clock tick, and the only WebSocket usage was the Deepgram voice-capture feature talking to an external vendor. Chose polling over a Supabase Realtime subscription, despite confirming RLS would actually support a direct-browser subscription safely — a Realtime subscription would have been the first place in this app reading directly from Supabase instead of through a Lambda, a bigger precedent-setting architecture decision than this one panel deserved to carry. Flagged as a real future option if 20-second staleness ever becomes a genuine problem for a dispatcher in practice, not built here.</w:t>
+      </w:r>
+    </w:p>
+    <w:p>
+      <w:pPr>
+        <w:pStyle w:val="4"/>
+      </w:pPr>
+      <w:r>
+        <w:t>What was built</w:t>
+      </w:r>
+    </w:p>
+    <w:p>
+      <w:pPr/>
+      <w:r>
+        <w:t>New Lambda list-live-feed (POST /jobs/live-feed, owner_admin) — essentially get-job-file’s existing query logic run for every en_route/on_site job at once instead of one job by id: fetches the contractor’s active jobs, fetches field_events for those job ids (newest-first), caps each job to its 5 most recent events in one pass, enriches with technician names via a single batched lookup, sorts jobs by most-recent-event descending, and returns a fully pre-grouped response so the frontend does zero client-side joining.</w:t>
+      </w:r>
+    </w:p>
+    <w:p>
+      <w:pPr/>
+      <w:r>
+        <w:t>Frontend: Panel 6 rewritten with a dynamic title, a loader wired to a polling effect (20-second interval) that only runs while Panel 6 is the active page, cleared on navigating away or unmount. A new LiveFeedJobCard component renders each job (identity, status pill, assigned technician, a “View job file” button reusing the existing modal) with its event timeline underneath, reusing JobFileModal’s exact event row structure and labels — the section’s existing CSS already had hand-tuned overrides for this shape, so no changes were needed there. A small new CSS rule backs the per-job card container itself, matching the existing bordered-card values used elsewhere in Reports rather than reusing that selector directly, since its 3-column grid layout doesn’t fit a vertically-stacked live feed.</w:t>
+      </w:r>
+    </w:p>
+    <w:p>
+      <w:pPr/>
+      <w:r>
+        <w:t>A real UX fix caught during browser verification, not code review: event timestamps were initially rendered time-only, which looked fine for today’s events but was genuinely misleading for a still-on_site job with events from over a week earlier (real test data had a job on-site since a prior week, still showing today) — a dispatcher scanning the feed could easily misread an old timestamp as “this afternoon.” Fixed to match JobFileModal’s existing convention of always showing the date alongside the time, caught by looking at the actual rendered screenshot, not by reasoning about the code.</w:t>
+      </w:r>
+    </w:p>
+    <w:p>
+      <w:pPr>
+        <w:pStyle w:val="4"/>
+      </w:pPr>
+      <w:r>
+        <w:t>What was tested (real, live — not just code review)</w:t>
+      </w:r>
+    </w:p>
+    <w:p>
+      <w:pPr>
+        <w:pStyle w:val="25"/>
+      </w:pPr>
+      <w:r>
+        <w:t>Live API call against the real test contractor: confirmed the response only includes en_route/on_site jobs, each job’s events array real/capped-to-5/descending by timestamp, and technician names correctly enriched.</w:t>
+      </w:r>
+    </w:p>
+    <w:p>
+      <w:pPr>
+        <w:pStyle w:val="25"/>
+      </w:pPr>
+      <w:r>
+        <w:t>Real browser (Playwright): opened Panel 6, confirmed the dynamic job count and real per-job cards, clicked “View job file” and confirmed the existing modal still opens and loads correctly.</w:t>
+      </w:r>
+    </w:p>
+    <w:p>
+      <w:pPr>
+        <w:pStyle w:val="25"/>
+      </w:pPr>
+      <w:r>
+        <w:t>Polling verified with real network-request timing, not assumed from the code: instrumented the browser to log every live-feed request while parked on Panel 6 — confirmed exactly 2 calls over 23 seconds, the second landing about 20 seconds after the first. Then navigated to a different panel and confirmed zero further calls over the next 22 seconds — the interval is genuinely cleared on navigating away.</w:t>
+      </w:r>
+    </w:p>
+    <w:p>
+      <w:pPr>
+        <w:pStyle w:val="25"/>
+      </w:pPr>
+      <w:r>
+        <w:t>Build and lint both clean throughout.</w:t>
+      </w:r>
+    </w:p>
+    <w:p>
+      <w:pPr>
+        <w:pStyle w:val="4"/>
+      </w:pPr>
+      <w:r>
+        <w:t>Files</w:t>
+      </w:r>
+    </w:p>
+    <w:p>
+      <w:pPr/>
+      <w:r>
+        <w:t>backend/functions/list-live-feed/ (new Lambda, deployed); backend/functions/package-lambda.ps1 (updated); src/command-dashboard/ContractorCommandDashboard.jsx (Panel 6 rewritten; LiveFeedJobCard added; live-feed state and the polling effect added); src/command-dashboard/dashboard.css (new live-feed card rules added); src/shared/services/api.js (getLiveFeed added).</w:t>
       </w:r>
     </w:p>
     <w:p>
@@ -11755,6 +12251,143 @@
       <w:r>
         <w:br w:type="page"/>
       </w:r>
+    </w:p>
+    <w:p>
+      <w:pPr>
+        <w:pStyle w:val="3"/>
+      </w:pPr>
+      <w:r>
+        <w:t>10.6a SES Sender/Recipient Verification — dev_email Mode Now Partially Live (2026-08-19)</w:t>
+      </w:r>
+    </w:p>
+    <w:p>
+      <w:pPr/>
+      <w:r>
+        <w:t>Section 10.6 built dev_email mode and set it as the Phase 1 default on add-technician / update-technician / resend-technician-setup, but at the time fieldloop/ses-credentials did not exist and zero SES identities were verified — every real send attempt failed gracefully with "SES sender not configured." That infrastructure gap is now partially closed, with no code changes — this section is purely AWS / Secrets Manager configuration.</w:t>
+      </w:r>
+    </w:p>
+    <w:p>
+      <w:pPr>
+        <w:pStyle w:val="4"/>
+      </w:pPr>
+      <w:r>
+        <w:t>What was done (verified independently via the AWS API, not just console screenshots)</w:t>
+      </w:r>
+    </w:p>
+    <w:p>
+      <w:pPr>
+        <w:pStyle w:val="25"/>
+      </w:pPr>
+      <w:r>
+        <w:rPr>
+          <w:b/>
+        </w:rPr>
+        <w:t xml:space="preserve">Sender domain verified: </w:t>
+      </w:r>
+      <w:r>
+        <w:t>fieldloopai.com — confirmed live via aws sesv2 get-email-identity: VerifiedForSendingStatus: true, DkimStatus: SUCCESS. (An earlier attempt at verifying a different domain, rrdmss.com, hit a real GreenGeeks/cPanel gotcha worth remembering if it recurs: cPanel’s Zone Editor auto-appends the base domain to whatever is typed in the Name field, so pasting SES’s full record name instead of just the subdomain part produces a doubled, non-matching hostname and a "DNS server could not find the specified domain name" error. fieldloopai.com was verified without hitting this.)</w:t>
+      </w:r>
+    </w:p>
+    <w:p>
+      <w:pPr>
+        <w:pStyle w:val="25"/>
+      </w:pPr>
+      <w:r>
+        <w:rPr>
+          <w:b/>
+        </w:rPr>
+        <w:t xml:space="preserve">fieldloop/ses-credentials secret created </w:t>
+      </w:r>
+      <w:r>
+        <w:t>in Secrets Manager: { "senderEmail": "noreply@fieldloopai.com" } — this is the exact shape messagingAdapter.js’s sendEmailReal() already expected (section 10.6), so it took effect immediately with no redeploy.</w:t>
+      </w:r>
+    </w:p>
+    <w:p>
+      <w:pPr>
+        <w:pStyle w:val="25"/>
+      </w:pPr>
+      <w:r>
+        <w:rPr>
+          <w:b/>
+        </w:rPr>
+        <w:t xml:space="preserve">Two recipient addresses verified </w:t>
+      </w:r>
+      <w:r>
+        <w:t>(seointern.jenex@gmail.com, premgca2025@gmail.com) via aws sesv2 create-email-identity plus each recipient clicking the confirmation link AWS sent them — confirmed live afterward via aws sesv2 get-email-identity, both VerifiedForSendingStatus: true.</w:t>
+      </w:r>
+    </w:p>
+    <w:p>
+      <w:pPr>
+        <w:pStyle w:val="25"/>
+      </w:pPr>
+      <w:r>
+        <w:rPr>
+          <w:b/>
+        </w:rPr>
+        <w:t xml:space="preserve">SES production access requested </w:t>
+      </w:r>
+      <w:r>
+        <w:t>— submitted via the console’s Account dashboard (transactional use case, describing the technician setup-link email plus future estimate/invoice notifications). Status as of this writing: still under AWS review — confirmed live via aws sesv2 get-account: ProductionAccessEnabled: false. This is an external approval with no fixed timeline on our side.</w:t>
+      </w:r>
+    </w:p>
+    <w:p>
+      <w:pPr>
+        <w:pStyle w:val="4"/>
+      </w:pPr>
+      <w:r>
+        <w:t>What this does and doesn’t unlock right now</w:t>
+      </w:r>
+    </w:p>
+    <w:p>
+      <w:pPr>
+        <w:pStyle w:val="25"/>
+      </w:pPr>
+      <w:r>
+        <w:rPr>
+          <w:b/>
+        </w:rPr>
+        <w:t xml:space="preserve">Can send for real, today: </w:t>
+      </w:r>
+      <w:r>
+        <w:t>from any noreply@ / @fieldloopai.com address, to seointern.jenex@gmail.com or premgca2025@gmail.com specifically — SES sandbox mode allows sending to any individually-verified recipient regardless of production-access status. A real Add Technician call using one of these two addresses as the technician’s email now produces a genuine email in that inbox, not just a graceful-failure response.</w:t>
+      </w:r>
+    </w:p>
+    <w:p>
+      <w:pPr>
+        <w:pStyle w:val="25"/>
+      </w:pPr>
+      <w:r>
+        <w:rPr>
+          <w:b/>
+        </w:rPr>
+        <w:t xml:space="preserve">Cannot yet send to: </w:t>
+      </w:r>
+      <w:r>
+        <w:t>any other/arbitrary address — i.e. a real technician’s actual inbox — until the production access request above is approved. This is a hard SES account-level restriction, not something messagingAdapter.js can work around.</w:t>
+      </w:r>
+    </w:p>
+    <w:p>
+      <w:pPr/>
+      <w:r>
+        <w:t>No MESSAGING_PROVIDER change was needed — it was already defaulted to dev_email since section 10.6, so this configuration alone is what flips real sends on for the two verified addresses. Once production access is approved, nothing code-side changes — dev_email mode will simply start succeeding for arbitrary recipients instead of only the two verified test addresses.</w:t>
+      </w:r>
+    </w:p>
+    <w:p>
+      <w:pPr>
+        <w:pStyle w:val="4"/>
+      </w:pPr>
+      <w:r>
+        <w:t>Files</w:t>
+      </w:r>
+    </w:p>
+    <w:p>
+      <w:pPr/>
+      <w:r>
+        <w:t>None — infrastructure/Secrets Manager only (fieldloop/ses-credentials created; no code, migration, or deployment changes).</w:t>
+      </w:r>
+    </w:p>
+    <w:p>
+      <w:pPr/>
     </w:p>
     <w:p>
       <w:pPr>
@@ -16212,6 +16845,630 @@
           </w:p>
         </w:tc>
       </w:tr>
+      <w:tr>
+        <w:tc>
+          <w:tcPr>
+            <w:tcW w:type="dxa" w:w="1727"/>
+          </w:tcPr>
+          <w:p>
+            <w:r>
+              <w:t>list-vehicles</w:t>
+            </w:r>
+          </w:p>
+        </w:tc>
+        <w:tc>
+          <w:tcPr>
+            <w:tcW w:type="dxa" w:w="1727"/>
+          </w:tcPr>
+          <w:p>
+            <w:r>
+              <w:t>fieldloop-list-vehicles</w:t>
+            </w:r>
+          </w:p>
+        </w:tc>
+        <w:tc>
+          <w:tcPr>
+            <w:tcW w:type="dxa" w:w="1946"/>
+          </w:tcPr>
+          <w:p>
+            <w:r>
+              <w:t>POST /vehicles/list</w:t>
+            </w:r>
+          </w:p>
+        </w:tc>
+        <w:tc>
+          <w:tcPr>
+            <w:tcW w:type="dxa" w:w="1728"/>
+          </w:tcPr>
+          <w:p>
+            <w:r>
+              <w:t>owner_admin</w:t>
+            </w:r>
+          </w:p>
+        </w:tc>
+        <w:tc>
+          <w:tcPr>
+            <w:tcW w:type="dxa" w:w="1728"/>
+          </w:tcPr>
+          <w:p>
+            <w:r>
+              <w:t>Section 8.9 — real fleet roster for the contractor</w:t>
+            </w:r>
+          </w:p>
+        </w:tc>
+      </w:tr>
+      <w:tr>
+        <w:tc>
+          <w:tcPr>
+            <w:tcW w:type="dxa" w:w="1727"/>
+          </w:tcPr>
+          <w:p>
+            <w:r>
+              <w:t>add-vehicle</w:t>
+            </w:r>
+          </w:p>
+        </w:tc>
+        <w:tc>
+          <w:tcPr>
+            <w:tcW w:type="dxa" w:w="1727"/>
+          </w:tcPr>
+          <w:p>
+            <w:r>
+              <w:t>fieldloop-add-vehicle</w:t>
+            </w:r>
+          </w:p>
+        </w:tc>
+        <w:tc>
+          <w:tcPr>
+            <w:tcW w:type="dxa" w:w="1946"/>
+          </w:tcPr>
+          <w:p>
+            <w:r>
+              <w:t>POST /vehicles</w:t>
+            </w:r>
+          </w:p>
+        </w:tc>
+        <w:tc>
+          <w:tcPr>
+            <w:tcW w:type="dxa" w:w="1728"/>
+          </w:tcPr>
+          <w:p>
+            <w:r>
+              <w:t>owner_admin</w:t>
+            </w:r>
+          </w:p>
+        </w:tc>
+        <w:tc>
+          <w:tcPr>
+            <w:tcW w:type="dxa" w:w="1728"/>
+          </w:tcPr>
+          <w:p>
+            <w:r>
+              <w:t>Section 8.9 — only unit_number is actually required (verified via probe-insert)</w:t>
+            </w:r>
+          </w:p>
+        </w:tc>
+      </w:tr>
+      <w:tr>
+        <w:tc>
+          <w:tcPr>
+            <w:tcW w:type="dxa" w:w="1727"/>
+          </w:tcPr>
+          <w:p>
+            <w:r>
+              <w:t>update-vehicle</w:t>
+            </w:r>
+          </w:p>
+        </w:tc>
+        <w:tc>
+          <w:tcPr>
+            <w:tcW w:type="dxa" w:w="1727"/>
+          </w:tcPr>
+          <w:p>
+            <w:r>
+              <w:t>fieldloop-update-vehicle</w:t>
+            </w:r>
+          </w:p>
+        </w:tc>
+        <w:tc>
+          <w:tcPr>
+            <w:tcW w:type="dxa" w:w="1946"/>
+          </w:tcPr>
+          <w:p>
+            <w:r>
+              <w:t>POST /vehicles/update</w:t>
+            </w:r>
+          </w:p>
+        </w:tc>
+        <w:tc>
+          <w:tcPr>
+            <w:tcW w:type="dxa" w:w="1728"/>
+          </w:tcPr>
+          <w:p>
+            <w:r>
+              <w:t>owner_admin</w:t>
+            </w:r>
+          </w:p>
+        </w:tc>
+        <w:tc>
+          <w:tcPr>
+            <w:tcW w:type="dxa" w:w="1728"/>
+          </w:tcPr>
+          <w:p>
+            <w:r>
+              <w:t>Section 8.9 — partial update; also backs “Retire” (is_active: false, a soft-delete)</w:t>
+            </w:r>
+          </w:p>
+        </w:tc>
+      </w:tr>
+      <w:tr>
+        <w:tc>
+          <w:tcPr>
+            <w:tcW w:type="dxa" w:w="1727"/>
+          </w:tcPr>
+          <w:p>
+            <w:r>
+              <w:t>list-customers</w:t>
+            </w:r>
+          </w:p>
+        </w:tc>
+        <w:tc>
+          <w:tcPr>
+            <w:tcW w:type="dxa" w:w="1727"/>
+          </w:tcPr>
+          <w:p>
+            <w:r>
+              <w:t>fieldloop-list-customers</w:t>
+            </w:r>
+          </w:p>
+        </w:tc>
+        <w:tc>
+          <w:tcPr>
+            <w:tcW w:type="dxa" w:w="1946"/>
+          </w:tcPr>
+          <w:p>
+            <w:r>
+              <w:t>POST /customers/list</w:t>
+            </w:r>
+          </w:p>
+        </w:tc>
+        <w:tc>
+          <w:tcPr>
+            <w:tcW w:type="dxa" w:w="1728"/>
+          </w:tcPr>
+          <w:p>
+            <w:r>
+              <w:t>owner_admin</w:t>
+            </w:r>
+          </w:p>
+        </w:tc>
+        <w:tc>
+          <w:tcPr>
+            <w:tcW w:type="dxa" w:w="1728"/>
+          </w:tcPr>
+          <w:p>
+            <w:r>
+              <w:t>Section 8.9 — every customer for the contractor, including ones with zero jobs, with real job_count/lifetime_value</w:t>
+            </w:r>
+          </w:p>
+        </w:tc>
+      </w:tr>
+      <w:tr>
+        <w:tc>
+          <w:tcPr>
+            <w:tcW w:type="dxa" w:w="1727"/>
+          </w:tcPr>
+          <w:p>
+            <w:r>
+              <w:t>add-customer</w:t>
+            </w:r>
+          </w:p>
+        </w:tc>
+        <w:tc>
+          <w:tcPr>
+            <w:tcW w:type="dxa" w:w="1727"/>
+          </w:tcPr>
+          <w:p>
+            <w:r>
+              <w:t>fieldloop-add-customer</w:t>
+            </w:r>
+          </w:p>
+        </w:tc>
+        <w:tc>
+          <w:tcPr>
+            <w:tcW w:type="dxa" w:w="1946"/>
+          </w:tcPr>
+          <w:p>
+            <w:r>
+              <w:t>POST /customers</w:t>
+            </w:r>
+          </w:p>
+        </w:tc>
+        <w:tc>
+          <w:tcPr>
+            <w:tcW w:type="dxa" w:w="1728"/>
+          </w:tcPr>
+          <w:p>
+            <w:r>
+              <w:t>owner_admin</w:t>
+            </w:r>
+          </w:p>
+        </w:tc>
+        <w:tc>
+          <w:tcPr>
+            <w:tcW w:type="dxa" w:w="1728"/>
+          </w:tcPr>
+          <w:p>
+            <w:r>
+              <w:t>Section 8.9 — dedupes by normalized phone; service_address is NOT NULL, found live via a real failed insert</w:t>
+            </w:r>
+          </w:p>
+        </w:tc>
+      </w:tr>
+      <w:tr>
+        <w:tc>
+          <w:tcPr>
+            <w:tcW w:type="dxa" w:w="1727"/>
+          </w:tcPr>
+          <w:p>
+            <w:r>
+              <w:t>update-customer</w:t>
+            </w:r>
+          </w:p>
+        </w:tc>
+        <w:tc>
+          <w:tcPr>
+            <w:tcW w:type="dxa" w:w="1727"/>
+          </w:tcPr>
+          <w:p>
+            <w:r>
+              <w:t>fieldloop-update-customer</w:t>
+            </w:r>
+          </w:p>
+        </w:tc>
+        <w:tc>
+          <w:tcPr>
+            <w:tcW w:type="dxa" w:w="1946"/>
+          </w:tcPr>
+          <w:p>
+            <w:r>
+              <w:t>POST /customers/update</w:t>
+            </w:r>
+          </w:p>
+        </w:tc>
+        <w:tc>
+          <w:tcPr>
+            <w:tcW w:type="dxa" w:w="1728"/>
+          </w:tcPr>
+          <w:p>
+            <w:r>
+              <w:t>owner_admin</w:t>
+            </w:r>
+          </w:p>
+        </w:tc>
+        <w:tc>
+          <w:tcPr>
+            <w:tcW w:type="dxa" w:w="1728"/>
+          </w:tcPr>
+          <w:p>
+            <w:r>
+              <w:t>Section 8.9 — partial update</w:t>
+            </w:r>
+          </w:p>
+        </w:tc>
+      </w:tr>
+      <w:tr>
+        <w:tc>
+          <w:tcPr>
+            <w:tcW w:type="dxa" w:w="1727"/>
+          </w:tcPr>
+          <w:p>
+            <w:r>
+              <w:t>list-team</w:t>
+            </w:r>
+          </w:p>
+        </w:tc>
+        <w:tc>
+          <w:tcPr>
+            <w:tcW w:type="dxa" w:w="1727"/>
+          </w:tcPr>
+          <w:p>
+            <w:r>
+              <w:t>fieldloop-list-team</w:t>
+            </w:r>
+          </w:p>
+        </w:tc>
+        <w:tc>
+          <w:tcPr>
+            <w:tcW w:type="dxa" w:w="1946"/>
+          </w:tcPr>
+          <w:p>
+            <w:r>
+              <w:t>POST /team/list</w:t>
+            </w:r>
+          </w:p>
+        </w:tc>
+        <w:tc>
+          <w:tcPr>
+            <w:tcW w:type="dxa" w:w="1728"/>
+          </w:tcPr>
+          <w:p>
+            <w:r>
+              <w:t>owner_admin</w:t>
+            </w:r>
+          </w:p>
+        </w:tc>
+        <w:tc>
+          <w:tcPr>
+            <w:tcW w:type="dxa" w:w="1728"/>
+          </w:tcPr>
+          <w:p>
+            <w:r>
+              <w:t>Section 8.10 — real contractor_users roster (today: owner_admin only)</w:t>
+            </w:r>
+          </w:p>
+        </w:tc>
+      </w:tr>
+      <w:tr>
+        <w:tc>
+          <w:tcPr>
+            <w:tcW w:type="dxa" w:w="1727"/>
+          </w:tcPr>
+          <w:p>
+            <w:r>
+              <w:t>list-audit-log</w:t>
+            </w:r>
+          </w:p>
+        </w:tc>
+        <w:tc>
+          <w:tcPr>
+            <w:tcW w:type="dxa" w:w="1727"/>
+          </w:tcPr>
+          <w:p>
+            <w:r>
+              <w:t>fieldloop-list-audit-log</w:t>
+            </w:r>
+          </w:p>
+        </w:tc>
+        <w:tc>
+          <w:tcPr>
+            <w:tcW w:type="dxa" w:w="1946"/>
+          </w:tcPr>
+          <w:p>
+            <w:r>
+              <w:t>POST /audit-log/list</w:t>
+            </w:r>
+          </w:p>
+        </w:tc>
+        <w:tc>
+          <w:tcPr>
+            <w:tcW w:type="dxa" w:w="1728"/>
+          </w:tcPr>
+          <w:p>
+            <w:r>
+              <w:t>owner_admin</w:t>
+            </w:r>
+          </w:p>
+        </w:tc>
+        <w:tc>
+          <w:tcPr>
+            <w:tcW w:type="dxa" w:w="1728"/>
+          </w:tcPr>
+          <w:p>
+            <w:r>
+              <w:t>Section 8.10 — real access_audit_log rows for the contractor, actor resolved to a real fl_users email where possible</w:t>
+            </w:r>
+          </w:p>
+        </w:tc>
+      </w:tr>
+      <w:tr>
+        <w:tc>
+          <w:tcPr>
+            <w:tcW w:type="dxa" w:w="1727"/>
+          </w:tcPr>
+          <w:p>
+            <w:r>
+              <w:t>list-retention-queue</w:t>
+            </w:r>
+          </w:p>
+        </w:tc>
+        <w:tc>
+          <w:tcPr>
+            <w:tcW w:type="dxa" w:w="1727"/>
+          </w:tcPr>
+          <w:p>
+            <w:r>
+              <w:t>fieldloop-list-retention-queue</w:t>
+            </w:r>
+          </w:p>
+        </w:tc>
+        <w:tc>
+          <w:tcPr>
+            <w:tcW w:type="dxa" w:w="1946"/>
+          </w:tcPr>
+          <w:p>
+            <w:r>
+              <w:t>POST /retention/list</w:t>
+            </w:r>
+          </w:p>
+        </w:tc>
+        <w:tc>
+          <w:tcPr>
+            <w:tcW w:type="dxa" w:w="1728"/>
+          </w:tcPr>
+          <w:p>
+            <w:r>
+              <w:t>owner_admin</w:t>
+            </w:r>
+          </w:p>
+        </w:tc>
+        <w:tc>
+          <w:tcPr>
+            <w:tcW w:type="dxa" w:w="1728"/>
+          </w:tcPr>
+          <w:p>
+            <w:r>
+              <w:t>Section 8.10 — computes real due retention checkpoints from jobs/customers data; never sends anything</w:t>
+            </w:r>
+          </w:p>
+        </w:tc>
+      </w:tr>
+      <w:tr>
+        <w:tc>
+          <w:tcPr>
+            <w:tcW w:type="dxa" w:w="1727"/>
+          </w:tcPr>
+          <w:p>
+            <w:r>
+              <w:t>update-retention-flag</w:t>
+            </w:r>
+          </w:p>
+        </w:tc>
+        <w:tc>
+          <w:tcPr>
+            <w:tcW w:type="dxa" w:w="1727"/>
+          </w:tcPr>
+          <w:p>
+            <w:r>
+              <w:t>fieldloop-update-retention-flag</w:t>
+            </w:r>
+          </w:p>
+        </w:tc>
+        <w:tc>
+          <w:tcPr>
+            <w:tcW w:type="dxa" w:w="1946"/>
+          </w:tcPr>
+          <w:p>
+            <w:r>
+              <w:t>POST /retention/update</w:t>
+            </w:r>
+          </w:p>
+        </w:tc>
+        <w:tc>
+          <w:tcPr>
+            <w:tcW w:type="dxa" w:w="1728"/>
+          </w:tcPr>
+          <w:p>
+            <w:r>
+              <w:t>owner_admin</w:t>
+            </w:r>
+          </w:p>
+        </w:tc>
+        <w:tc>
+          <w:tcPr>
+            <w:tcW w:type="dxa" w:w="1728"/>
+          </w:tcPr>
+          <w:p>
+            <w:r>
+              <w:t>Section 8.10 — Pause/Resume: toggles customers.retention_flags.paused</w:t>
+            </w:r>
+          </w:p>
+        </w:tc>
+      </w:tr>
+      <w:tr>
+        <w:tc>
+          <w:tcPr>
+            <w:tcW w:type="dxa" w:w="1727"/>
+          </w:tcPr>
+          <w:p>
+            <w:r>
+              <w:t>list-export-requests</w:t>
+            </w:r>
+          </w:p>
+        </w:tc>
+        <w:tc>
+          <w:tcPr>
+            <w:tcW w:type="dxa" w:w="1727"/>
+          </w:tcPr>
+          <w:p>
+            <w:r>
+              <w:t>fieldloop-list-export-requests</w:t>
+            </w:r>
+          </w:p>
+        </w:tc>
+        <w:tc>
+          <w:tcPr>
+            <w:tcW w:type="dxa" w:w="1946"/>
+          </w:tcPr>
+          <w:p>
+            <w:r>
+              <w:t>POST /export-requests/list</w:t>
+            </w:r>
+          </w:p>
+        </w:tc>
+        <w:tc>
+          <w:tcPr>
+            <w:tcW w:type="dxa" w:w="1728"/>
+          </w:tcPr>
+          <w:p>
+            <w:r>
+              <w:t>owner_admin</w:t>
+            </w:r>
+          </w:p>
+        </w:tc>
+        <w:tc>
+          <w:tcPr>
+            <w:tcW w:type="dxa" w:w="1728"/>
+          </w:tcPr>
+          <w:p>
+            <w:r>
+              <w:t>Section 8.10 — real data_export_requests rows for the contractor</w:t>
+            </w:r>
+          </w:p>
+        </w:tc>
+      </w:tr>
+      <w:tr>
+        <w:tc>
+          <w:tcPr>
+            <w:tcW w:type="dxa" w:w="1727"/>
+          </w:tcPr>
+          <w:p>
+            <w:r>
+              <w:t>create-export-request</w:t>
+            </w:r>
+          </w:p>
+        </w:tc>
+        <w:tc>
+          <w:tcPr>
+            <w:tcW w:type="dxa" w:w="1727"/>
+          </w:tcPr>
+          <w:p>
+            <w:r>
+              <w:t>fieldloop-create-export-request</w:t>
+            </w:r>
+          </w:p>
+        </w:tc>
+        <w:tc>
+          <w:tcPr>
+            <w:tcW w:type="dxa" w:w="1946"/>
+          </w:tcPr>
+          <w:p>
+            <w:r>
+              <w:t>POST /export-requests</w:t>
+            </w:r>
+          </w:p>
+        </w:tc>
+        <w:tc>
+          <w:tcPr>
+            <w:tcW w:type="dxa" w:w="1728"/>
+          </w:tcPr>
+          <w:p>
+            <w:r>
+              <w:t>owner_admin</w:t>
+            </w:r>
+          </w:p>
+        </w:tc>
+        <w:tc>
+          <w:tcPr>
+            <w:tcW w:type="dxa" w:w="1728"/>
+          </w:tcPr>
+          <w:p>
+            <w:r>
+              <w:t>Section 8.10 — real request-tracking only; no file-generation pipeline exists yet</w:t>
+            </w:r>
+          </w:p>
+        </w:tc>
+      </w:tr>
     </w:tbl>
     <w:p/>
     <w:p>
@@ -17714,14 +18971,8 @@
             <w:tcW w:w="4320" w:type="dxa"/>
           </w:tcPr>
           <w:p>
-            <w:pPr>
-              <w:spacing w:after="0" w:line="240" w:lineRule="auto"/>
-            </w:pPr>
-            <w:r>
-              <w:rPr>
-                <w:sz w:val="18"/>
-              </w:rPr>
-              <w:t>update, view, reveal, delete, export (rejected: create, CREATE, created, VIEWED, assign, add, access, read, insert, write, modify, login) — two existing call sites (get-contractor's 'VIEWED', create-contractor-portal-user's 'create') were found silently failing to write audit rows because of this, unfixed as of this writing</w:t>
+            <w:r>
+              <w:t>update, view, reveal, delete, export (rejected: create, CREATE, created, VIEWED, assign, add, access, read, insert, write, modify, login) — two existing call sites (get-contractor's 'VIEWED', create-contractor-portal-user's 'create') were found silently failing to write audit rows because of this; both fixed (Section 8.10a)</w:t>
             </w:r>
           </w:p>
         </w:tc>
@@ -17829,6 +19080,94 @@
           <w:p>
             <w:r>
               <w:t>draft, sent, signed, approved, rejected (rejected: submitted, awaiting_approval). Only ‘approved’/‘rejected’ are contractor-settable, and only from ‘signed’ (Section 8.6).</w:t>
+            </w:r>
+          </w:p>
+        </w:tc>
+      </w:tr>
+      <w:tr>
+        <w:tc>
+          <w:tcPr>
+            <w:tcW w:type="dxa" w:w="4320"/>
+          </w:tcPr>
+          <w:p>
+            <w:r>
+              <w:t>customers.preferred_contact</w:t>
+            </w:r>
+          </w:p>
+        </w:tc>
+        <w:tc>
+          <w:tcPr>
+            <w:tcW w:type="dxa" w:w="4320"/>
+          </w:tcPr>
+          <w:p>
+            <w:r>
+              <w:t>call, email, text (rejected: voice, sms, phone)</w:t>
+            </w:r>
+          </w:p>
+        </w:tc>
+      </w:tr>
+      <w:tr>
+        <w:tc>
+          <w:tcPr>
+            <w:tcW w:type="dxa" w:w="4320"/>
+          </w:tcPr>
+          <w:p>
+            <w:r>
+              <w:t>data_export_requests.export_type</w:t>
+            </w:r>
+          </w:p>
+        </w:tc>
+        <w:tc>
+          <w:tcPr>
+            <w:tcW w:type="dxa" w:w="4320"/>
+          </w:tcPr>
+          <w:p>
+            <w:r>
+              <w:t>full, jobs, invoices, single_job, media_only</w:t>
+            </w:r>
+          </w:p>
+        </w:tc>
+      </w:tr>
+      <w:tr>
+        <w:tc>
+          <w:tcPr>
+            <w:tcW w:type="dxa" w:w="4320"/>
+          </w:tcPr>
+          <w:p>
+            <w:r>
+              <w:t>data_export_requests.output_format</w:t>
+            </w:r>
+          </w:p>
+        </w:tc>
+        <w:tc>
+          <w:tcPr>
+            <w:tcW w:type="dxa" w:w="4320"/>
+          </w:tcPr>
+          <w:p>
+            <w:r>
+              <w:t>zip, csv, pdf</w:t>
+            </w:r>
+          </w:p>
+        </w:tc>
+      </w:tr>
+      <w:tr>
+        <w:tc>
+          <w:tcPr>
+            <w:tcW w:type="dxa" w:w="4320"/>
+          </w:tcPr>
+          <w:p>
+            <w:r>
+              <w:t>data_export_requests.status</w:t>
+            </w:r>
+          </w:p>
+        </w:tc>
+        <w:tc>
+          <w:tcPr>
+            <w:tcW w:type="dxa" w:w="4320"/>
+          </w:tcPr>
+          <w:p>
+            <w:r>
+              <w:t>queued, processing, ready, expired, failed (rejected: pending) — verified live via probe-insert/delete, matches the original planning schema document exactly</w:t>
             </w:r>
           </w:p>
         </w:tc>

</xml_diff>

<commit_message>
Document the unified login flow in CLAUDE.md, HANDOFF.md, and the E2E guide
Both docs still described the old two-login-page setup after ca2d387.
Updates route descriptions and file trees, adds HANDOFF.md §32 /
implementation guide §8.12 covering the change in full, matching each
doc's existing style.

Co-Authored-By: Claude Sonnet 5 <noreply@anthropic.com>
</commit_message>
<xml_diff>
--- a/FieldLoop_End_to_End_Implementation_Guide.docx
+++ b/FieldLoop_End_to_End_Implementation_Guide.docx
@@ -253,7 +253,7 @@
         <w:t xml:space="preserve">Registration Dashboard </w:t>
       </w:r>
       <w:r>
-        <w:t>(/staff/login, /staff) — an internal tool for FieldLoop staff (roles: admin, onboarding, finance, support, jenex_dev) to onboard and manage contractor records through an 8-step wizard. Fully wired to real Lambda + Supabase, tested end-to-end (API-level and real browser via Playwright) across all 5 staff roles.</w:t>
+        <w:t xml:space="preserve">(/staff/registration) — an internal tool for FieldLoop staff (roles: admin, onboarding, finance, support, jenex_dev) to onboard and manage contractor records through an 8-step wizard. Staff sign in on the same shared login page as contractors (/); admin lands on Platform Overview by default instead, see section 13. Fully wired to </w:t>
       </w:r>
     </w:p>
     <w:p>
@@ -8544,7 +8544,7 @@
           <w:b w:val="0"/>
           <w:i w:val="0"/>
         </w:rPr>
-        <w:t>Routes: /staff/login (StaffLoginPage, real Supabase Auth), /staff (RegistrationDashboard, redirects to /staff/login if not signed in). Roles: admin, onboarding, finance, support, jenex_dev.</w:t>
+        <w:t>Routes: / (shared LoginPage for both contractors and staff — auth resolves against contractor_users/fl_users after sign-in and routes accordingly), /staff (role dispatcher: admin -&gt; /staff/platform, other staff roles -&gt; /staff/registration), /staff/registration (RegistrationDashboard), /staff/login (compatibility redirect to /). Roles: admin, onboarding, finance, support, jenex_dev.</w:t>
       </w:r>
     </w:p>
     <w:p>
@@ -10910,6 +10910,196 @@
       <w:pPr/>
       <w:r>
         <w:t>backend/functions/list-live-feed/ (new Lambda, deployed); backend/functions/package-lambda.ps1 (updated); src/command-dashboard/ContractorCommandDashboard.jsx (Panel 6 rewritten; LiveFeedJobCard added; live-feed state and the polling effect added); src/command-dashboard/dashboard.css (new live-feed card rules added); src/shared/services/api.js (getLiveFeed added).</w:t>
+      </w:r>
+    </w:p>
+    <w:p>
+      <w:pPr>
+        <w:pStyle w:val="3"/>
+      </w:pPr>
+      <w:r>
+        <w:t>8.12 Unified Login Page + Role-Based Redirect + /staff Default Swap to Platform Overview (2026-08-22)</w:t>
+      </w:r>
+    </w:p>
+    <w:p>
+      <w:pPr>
+        <w:pStyle w:val="4"/>
+      </w:pPr>
+      <w:r>
+        <w:t>Why</w:t>
+      </w:r>
+    </w:p>
+    <w:p>
+      <w:pPr/>
+      <w:r>
+        <w:t>app.fieldloopai.com had two separate login entry points — / (ContractorLoginPage.jsx, checked contractor_users) and /staff/login (StaffLoginPage.jsx, checked fl_users) — and /staff always rendered the Registration wizard first regardless of role, even though only admin can see Platform Overview at all. The requested change: one shared login page, contractor credentials open the Command Center, admin credentials open Platform Overview by default, other staff roles still land on Registration, with a way to reach Registration from Platform Overview on demand.</w:t>
+      </w:r>
+    </w:p>
+    <w:p>
+      <w:pPr/>
+      <w:r>
+        <w:t>Planned with the project owner first (plan mode, no code written until the plan was reviewed and approved). A background research pass into the actual routing/auth code, done before the plan was written, turned up the two-login-page split — this reframed the request from “fix a broken redirect” to “there was never a single redirect to fix, build the unification instead,” and that finding was surfaced to the project owner as a clarifying question before the plan was finalized.</w:t>
+      </w:r>
+    </w:p>
+    <w:p>
+      <w:pPr>
+        <w:pStyle w:val="4"/>
+      </w:pPr>
+      <w:r>
+        <w:t>What was built</w:t>
+      </w:r>
+    </w:p>
+    <w:p>
+      <w:pPr>
+        <w:pStyle w:val="25"/>
+      </w:pPr>
+      <w:r>
+        <w:t>A new shared LoginPage.jsx (src/shared/) — one email/password form, generic FieldLoop branding, no “CONTRACTOR COMMAND CENTER” / “STAFF REGISTRATION WORKSPACE” copy, since which population a login belongs to is not known until after auth resolves. Same supabase.auth.signInWithPassword mechanism as before, just one shared UI. Replaces the deleted ContractorLoginPage.jsx and StaffLoginPage.jsx.</w:t>
+      </w:r>
+    </w:p>
+    <w:p>
+      <w:pPr>
+        <w:pStyle w:val="25"/>
+      </w:pPr>
+      <w:r>
+        <w:t>Root identity resolution in App.jsx: at / and /dashboard, both the existing useContractorAuth() and useStaffAuth() hooks run (reused as-is, not rewritten), and whichever resolves a row wins. A resolved contractor_users row renders ContractorCommandDashboard in place, unchanged from before. A resolved fl_users row redirects to /staff/platform for admin or /staff/registration for every other role. A session that matches neither table shows one generic “no account found for this login” error state, replacing the two near-duplicate messages the old pages had.</w:t>
+      </w:r>
+    </w:p>
+    <w:p>
+      <w:pPr>
+        <w:pStyle w:val="25"/>
+      </w:pPr>
+      <w:r>
+        <w:t>A new explicit rule for an edge case nothing guarded against before, or after: an auth identity with a row in both contractor_users and fl_users. The staff identity wins, since an internal account landing in a contractor’s workspace is judged the worse failure mode.</w:t>
+      </w:r>
+    </w:p>
+    <w:p>
+      <w:pPr>
+        <w:pStyle w:val="25"/>
+      </w:pPr>
+      <w:r>
+        <w:t>/staff became a role dispatcher rather than a page — it redirects admin to /staff/platform and every other role to /staff/registration, a new route hosting RegistrationDashboard with the same auth guard /staff used to have. /staff/platform and its contractor drill-down route are unchanged, still admin-gated exactly as before. /staff/login is now just a redirect back to / (kept as a compatibility stub so old bookmarks do not dead-end). Every route guard’s unauthenticated-redirect target changed from /staff/login to /, since there is only one login page now.</w:t>
+      </w:r>
+    </w:p>
+    <w:p>
+      <w:pPr>
+        <w:pStyle w:val="25"/>
+      </w:pPr>
+      <w:r>
+        <w:t>PlatformAdminDashboard.jsx’s existing “Registration Dashboard” header link, which used to point at /staff, was repointed to /staff/registration — leaving it at /staff would have bounced an admin straight back to Platform Overview through the new dispatcher.</w:t>
+      </w:r>
+    </w:p>
+    <w:p>
+      <w:pPr>
+        <w:pStyle w:val="25"/>
+      </w:pPr>
+      <w:r>
+        <w:t>Bundled into the same commit, unrelated to the login work: technicianSetupTokens.js (the master copy plus its four per-function copies) updated from the placeholder https://app.fieldloop.io to the real production origin, https://app.fieldloopai.com — a pre-existing uncommitted change picked up while staging this work.</w:t>
+      </w:r>
+    </w:p>
+    <w:p>
+      <w:pPr>
+        <w:pStyle w:val="4"/>
+      </w:pPr>
+      <w:r>
+        <w:t>What was tested (real browser, Playwright — not just code review)</w:t>
+      </w:r>
+    </w:p>
+    <w:p>
+      <w:pPr/>
+      <w:r>
+        <w:t>No project run skill existed yet for this app, and chromium-cli was not available in this environment, so a Playwright script (already a real devDependency) drove the actual dev server directly.</w:t>
+      </w:r>
+    </w:p>
+    <w:p>
+      <w:pPr>
+        <w:pStyle w:val="25"/>
+      </w:pPr>
+      <w:r>
+        <w:t>The unified login page renders at / with no role-specific branding and no console errors.</w:t>
+      </w:r>
+    </w:p>
+    <w:p>
+      <w:pPr>
+        <w:pStyle w:val="25"/>
+      </w:pPr>
+      <w:r>
+        <w:t>A contractor login (the standing pw-contractor test account) stays on / and renders the Command Center.</w:t>
+      </w:r>
+    </w:p>
+    <w:p>
+      <w:pPr>
+        <w:pStyle w:val="25"/>
+      </w:pPr>
+      <w:r>
+        <w:t>An admin login redirects to /staff/platform.</w:t>
+      </w:r>
+    </w:p>
+    <w:p>
+      <w:pPr>
+        <w:pStyle w:val="25"/>
+      </w:pPr>
+      <w:r>
+        <w:t>A non-admin staff login (test-onboarding) redirects to /staff/registration.</w:t>
+      </w:r>
+    </w:p>
+    <w:p>
+      <w:pPr>
+        <w:pStyle w:val="25"/>
+      </w:pPr>
+      <w:r>
+        <w:t>Direct navigation to /staff while already authenticated dispatches correctly by role, both ways.</w:t>
+      </w:r>
+    </w:p>
+    <w:p>
+      <w:pPr>
+        <w:pStyle w:val="25"/>
+      </w:pPr>
+      <w:r>
+        <w:t>/staff/login redirects an unauthenticated visitor to /.</w:t>
+      </w:r>
+    </w:p>
+    <w:p>
+      <w:pPr>
+        <w:pStyle w:val="25"/>
+      </w:pPr>
+      <w:r>
+        <w:t>Unauthenticated direct navigation to /staff, /staff/registration, and /staff/platform all land on /.</w:t>
+      </w:r>
+    </w:p>
+    <w:p>
+      <w:pPr>
+        <w:pStyle w:val="25"/>
+      </w:pPr>
+      <w:r>
+        <w:t>The “Registration Dashboard” and “Platform Overview” header links cross-navigate correctly in both directions.</w:t>
+      </w:r>
+    </w:p>
+    <w:p>
+      <w:pPr>
+        <w:pStyle w:val="25"/>
+      </w:pPr>
+      <w:r>
+        <w:t>Screenshots confirmed the rendered pages themselves, not just the resulting URLs.</w:t>
+      </w:r>
+    </w:p>
+    <w:p>
+      <w:pPr/>
+      <w:r>
+        <w:t>One flaky result, recorded rather than hand-waved away: a single contractor-login run flashed the “no account found” error state instead of the dashboard. Six immediate repeats afterward were all clean. The underlying cause — an unguarded race in useContractorAuth/useStaffAuth between the initial getSession() promise and the onAuthStateChange callback, which can resolve out of order — is pre-existing and was not modified by this pass; this change just makes both hooks run concurrently at / where previously only one ran per route, which could make a latent race like this surface more often than before. Not chased further since it did not reproduce; worth a look if a real user ever reports a login flash-of-error.</w:t>
+      </w:r>
+    </w:p>
+    <w:p>
+      <w:pPr>
+        <w:pStyle w:val="4"/>
+      </w:pPr>
+      <w:r>
+        <w:t>Files</w:t>
+      </w:r>
+    </w:p>
+    <w:p>
+      <w:pPr/>
+      <w:r>
+        <w:t>src/shared/LoginPage.jsx (new); src/App.jsx (root section rewrite, /staff dispatcher, new /staff/registration route, guard redirect targets); src/registration-dashboard/PlatformAdminDashboard.jsx (Registration Dashboard link repointed); src/command-dashboard/ContractorLoginPage.jsx and src/registration-dashboard/StaffLoginPage.jsx (deleted); TESTING_GUIDE.md / TESTING_GUIDE.docx (updated to match, same pass); the technicianSetupTokens.js master copy and its four per-function copies in backend/functions/ (domain fix, unrelated pre-existing change committed alongside).</w:t>
       </w:r>
     </w:p>
     <w:p>

</xml_diff>